<commit_message>
DevOps in Detail: A Comprehensive Guide   3/3/3035
</commit_message>
<xml_diff>
--- a/python/notes/baisc.docx
+++ b/python/notes/baisc.docx
@@ -3,7 +3,20 @@
 <w:document xmlns:wpc="http://schemas.microsoft.com/office/word/2010/wordprocessingCanvas" xmlns:cx="http://schemas.microsoft.com/office/drawing/2014/chartex" xmlns:cx1="http://schemas.microsoft.com/office/drawing/2015/9/8/chartex" xmlns:cx2="http://schemas.microsoft.com/office/drawing/2015/10/21/chartex" xmlns:cx3="http://schemas.microsoft.com/office/drawing/2016/5/9/chartex" xmlns:cx4="http://schemas.microsoft.com/office/drawing/2016/5/10/chartex" xmlns:cx5="http://schemas.microsoft.com/office/drawing/2016/5/11/chartex" xmlns:cx6="http://schemas.microsoft.com/office/drawing/2016/5/12/chartex" xmlns:cx7="http://schemas.microsoft.com/office/drawing/2016/5/13/chartex" xmlns:cx8="http://schemas.microsoft.com/office/drawing/2016/5/14/chartex" xmlns:mc="http://schemas.openxmlformats.org/markup-compatibility/2006" xmlns:aink="http://schemas.microsoft.com/office/drawing/2016/ink" xmlns:am3d="http://schemas.microsoft.com/office/drawing/2017/model3d" xmlns:o="urn:schemas-microsoft-com:office:office" xmlns:oel="http://schemas.microsoft.com/office/2019/extlst" xmlns:r="http://schemas.openxmlformats.org/officeDocument/2006/relationships" xmlns:m="http://schemas.openxmlformats.org/officeDocument/2006/math" xmlns:v="urn:schemas-microsoft-com:vml" xmlns:wp14="http://schemas.microsoft.com/office/word/2010/wordprocessingDrawing" xmlns:wp="http://schemas.openxmlformats.org/drawingml/2006/wordprocessingDrawing" xmlns:w10="urn:schemas-microsoft-com:office:word" xmlns:w="http://schemas.openxmlformats.org/wordprocessingml/2006/main" xmlns:w14="http://schemas.microsoft.com/office/word/2010/wordml" xmlns:w15="http://schemas.microsoft.com/office/word/2012/wordml" xmlns:w16cex="http://schemas.microsoft.com/office/word/2018/wordml/cex" xmlns:w16cid="http://schemas.microsoft.com/office/word/2016/wordml/cid" xmlns:w16="http://schemas.microsoft.com/office/word/2018/wordml" xmlns:w16du="http://schemas.microsoft.com/office/word/2023/wordml/word16du" xmlns:w16sdtdh="http://schemas.microsoft.com/office/word/2020/wordml/sdtdatahash" xmlns:w16sdtfl="http://schemas.microsoft.com/office/word/2024/wordml/sdtformatlock" xmlns:w16se="http://schemas.microsoft.com/office/word/2015/wordml/symex" xmlns:wpg="http://schemas.microsoft.com/office/word/2010/wordprocessingGroup" xmlns:wpi="http://schemas.microsoft.com/office/word/2010/wordprocessingInk" xmlns:wne="http://schemas.microsoft.com/office/word/2006/wordml" xmlns:wps="http://schemas.microsoft.com/office/word/2010/wordprocessingShape" mc:Ignorable="w14 w15 w16se w16cid w16 w16cex w16sdtdh w16sdtfl w16du wp14">
   <w:body>
     <w:p>
-      <w:r>
+      <w:pPr>
+        <w:rPr>
+          <w:rFonts w:ascii="Times New Roman" w:hAnsi="Times New Roman" w:cs="Times New Roman"/>
+          <w:sz w:val="24"/>
+          <w:szCs w:val="24"/>
+        </w:rPr>
+      </w:pPr>
+      <w:r>
+        <w:rPr>
+          <w:rFonts w:ascii="Times New Roman" w:hAnsi="Times New Roman" w:cs="Times New Roman"/>
+          <w:noProof/>
+          <w:sz w:val="24"/>
+          <w:szCs w:val="24"/>
+        </w:rPr>
         <w:drawing>
           <wp:inline distT="0" distB="0" distL="0" distR="0" wp14:anchorId="2BCC43F7" wp14:editId="3F0D5C5C">
             <wp:extent cx="6750050" cy="3343910"/>
@@ -20,7 +33,7 @@
                     <pic:cNvPicPr/>
                   </pic:nvPicPr>
                   <pic:blipFill>
-                    <a:blip r:embed="rId4"/>
+                    <a:blip r:embed="rId5"/>
                     <a:stretch>
                       <a:fillRect/>
                     </a:stretch>
@@ -41,6 +54,3610 @@
         </w:drawing>
       </w:r>
     </w:p>
+    <w:p>
+      <w:pPr>
+        <w:shd w:val="clear" w:color="auto" w:fill="D9E2F3" w:themeFill="accent1" w:themeFillTint="33"/>
+        <w:rPr>
+          <w:rFonts w:ascii="Times New Roman" w:hAnsi="Times New Roman" w:cs="Times New Roman"/>
+          <w:b/>
+          <w:bCs/>
+          <w:sz w:val="24"/>
+          <w:szCs w:val="24"/>
+        </w:rPr>
+      </w:pPr>
+      <w:r>
+        <w:rPr>
+          <w:rFonts w:ascii="Times New Roman" w:hAnsi="Times New Roman" w:cs="Times New Roman"/>
+          <w:b/>
+          <w:bCs/>
+          <w:sz w:val="24"/>
+          <w:szCs w:val="24"/>
+        </w:rPr>
+        <w:t>Understanding *</w:t>
+      </w:r>
+      <w:proofErr w:type="spellStart"/>
+      <w:r>
+        <w:rPr>
+          <w:rFonts w:ascii="Times New Roman" w:hAnsi="Times New Roman" w:cs="Times New Roman"/>
+          <w:b/>
+          <w:bCs/>
+          <w:sz w:val="24"/>
+          <w:szCs w:val="24"/>
+        </w:rPr>
+        <w:t>args</w:t>
+      </w:r>
+      <w:proofErr w:type="spellEnd"/>
+      <w:r>
+        <w:rPr>
+          <w:rFonts w:ascii="Times New Roman" w:hAnsi="Times New Roman" w:cs="Times New Roman"/>
+          <w:b/>
+          <w:bCs/>
+          <w:sz w:val="24"/>
+          <w:szCs w:val="24"/>
+        </w:rPr>
+        <w:t xml:space="preserve"> and **</w:t>
+      </w:r>
+      <w:proofErr w:type="spellStart"/>
+      <w:r>
+        <w:rPr>
+          <w:rFonts w:ascii="Times New Roman" w:hAnsi="Times New Roman" w:cs="Times New Roman"/>
+          <w:b/>
+          <w:bCs/>
+          <w:sz w:val="24"/>
+          <w:szCs w:val="24"/>
+        </w:rPr>
+        <w:t>kwargs</w:t>
+      </w:r>
+      <w:proofErr w:type="spellEnd"/>
+      <w:r>
+        <w:rPr>
+          <w:rFonts w:ascii="Times New Roman" w:hAnsi="Times New Roman" w:cs="Times New Roman"/>
+          <w:b/>
+          <w:bCs/>
+          <w:sz w:val="24"/>
+          <w:szCs w:val="24"/>
+        </w:rPr>
+        <w:t xml:space="preserve"> in Python</w:t>
+      </w:r>
+    </w:p>
+    <w:p>
+      <w:pPr>
+        <w:rPr>
+          <w:rFonts w:ascii="Times New Roman" w:hAnsi="Times New Roman" w:cs="Times New Roman"/>
+          <w:sz w:val="24"/>
+          <w:szCs w:val="24"/>
+        </w:rPr>
+      </w:pPr>
+      <w:r>
+        <w:rPr>
+          <w:rFonts w:ascii="Times New Roman" w:hAnsi="Times New Roman" w:cs="Times New Roman"/>
+          <w:sz w:val="24"/>
+          <w:szCs w:val="24"/>
+        </w:rPr>
+        <w:t>In Python, *</w:t>
+      </w:r>
+      <w:proofErr w:type="spellStart"/>
+      <w:r>
+        <w:rPr>
+          <w:rFonts w:ascii="Times New Roman" w:hAnsi="Times New Roman" w:cs="Times New Roman"/>
+          <w:sz w:val="24"/>
+          <w:szCs w:val="24"/>
+        </w:rPr>
+        <w:t>args</w:t>
+      </w:r>
+      <w:proofErr w:type="spellEnd"/>
+      <w:r>
+        <w:rPr>
+          <w:rFonts w:ascii="Times New Roman" w:hAnsi="Times New Roman" w:cs="Times New Roman"/>
+          <w:sz w:val="24"/>
+          <w:szCs w:val="24"/>
+        </w:rPr>
+        <w:t xml:space="preserve"> and **</w:t>
+      </w:r>
+      <w:proofErr w:type="spellStart"/>
+      <w:r>
+        <w:rPr>
+          <w:rFonts w:ascii="Times New Roman" w:hAnsi="Times New Roman" w:cs="Times New Roman"/>
+          <w:sz w:val="24"/>
+          <w:szCs w:val="24"/>
+        </w:rPr>
+        <w:t>kwargs</w:t>
+      </w:r>
+      <w:proofErr w:type="spellEnd"/>
+      <w:r>
+        <w:rPr>
+          <w:rFonts w:ascii="Times New Roman" w:hAnsi="Times New Roman" w:cs="Times New Roman"/>
+          <w:sz w:val="24"/>
+          <w:szCs w:val="24"/>
+        </w:rPr>
+        <w:t xml:space="preserve"> allow functions to accept </w:t>
+      </w:r>
+      <w:r>
+        <w:rPr>
+          <w:rFonts w:ascii="Times New Roman" w:hAnsi="Times New Roman" w:cs="Times New Roman"/>
+          <w:b/>
+          <w:bCs/>
+          <w:sz w:val="24"/>
+          <w:szCs w:val="24"/>
+        </w:rPr>
+        <w:t>a variable number of arguments</w:t>
+      </w:r>
+      <w:r>
+        <w:rPr>
+          <w:rFonts w:ascii="Times New Roman" w:hAnsi="Times New Roman" w:cs="Times New Roman"/>
+          <w:sz w:val="24"/>
+          <w:szCs w:val="24"/>
+        </w:rPr>
+        <w:t>.</w:t>
+      </w:r>
+    </w:p>
+    <w:p>
+      <w:pPr>
+        <w:rPr>
+          <w:rFonts w:ascii="Times New Roman" w:hAnsi="Times New Roman" w:cs="Times New Roman"/>
+          <w:b/>
+          <w:bCs/>
+          <w:sz w:val="24"/>
+          <w:szCs w:val="24"/>
+        </w:rPr>
+      </w:pPr>
+      <w:r>
+        <w:rPr>
+          <w:rFonts w:ascii="Times New Roman" w:hAnsi="Times New Roman" w:cs="Times New Roman"/>
+          <w:b/>
+          <w:bCs/>
+          <w:sz w:val="24"/>
+          <w:szCs w:val="24"/>
+        </w:rPr>
+        <w:t>1. What is *</w:t>
+      </w:r>
+      <w:proofErr w:type="spellStart"/>
+      <w:r>
+        <w:rPr>
+          <w:rFonts w:ascii="Times New Roman" w:hAnsi="Times New Roman" w:cs="Times New Roman"/>
+          <w:b/>
+          <w:bCs/>
+          <w:sz w:val="24"/>
+          <w:szCs w:val="24"/>
+        </w:rPr>
+        <w:t>args</w:t>
+      </w:r>
+      <w:proofErr w:type="spellEnd"/>
+      <w:r>
+        <w:rPr>
+          <w:rFonts w:ascii="Times New Roman" w:hAnsi="Times New Roman" w:cs="Times New Roman"/>
+          <w:b/>
+          <w:bCs/>
+          <w:sz w:val="24"/>
+          <w:szCs w:val="24"/>
+        </w:rPr>
+        <w:t>?</w:t>
+      </w:r>
+    </w:p>
+    <w:p>
+      <w:pPr>
+        <w:rPr>
+          <w:rFonts w:ascii="Times New Roman" w:hAnsi="Times New Roman" w:cs="Times New Roman"/>
+          <w:sz w:val="24"/>
+          <w:szCs w:val="24"/>
+        </w:rPr>
+      </w:pPr>
+      <w:r>
+        <w:rPr>
+          <w:rFonts w:ascii="Times New Roman" w:hAnsi="Times New Roman" w:cs="Times New Roman"/>
+          <w:sz w:val="24"/>
+          <w:szCs w:val="24"/>
+        </w:rPr>
+        <w:t>*</w:t>
+      </w:r>
+      <w:proofErr w:type="spellStart"/>
+      <w:r>
+        <w:rPr>
+          <w:rFonts w:ascii="Times New Roman" w:hAnsi="Times New Roman" w:cs="Times New Roman"/>
+          <w:sz w:val="24"/>
+          <w:szCs w:val="24"/>
+        </w:rPr>
+        <w:t>args</w:t>
+      </w:r>
+      <w:proofErr w:type="spellEnd"/>
+      <w:r>
+        <w:rPr>
+          <w:rFonts w:ascii="Times New Roman" w:hAnsi="Times New Roman" w:cs="Times New Roman"/>
+          <w:sz w:val="24"/>
+          <w:szCs w:val="24"/>
+        </w:rPr>
+        <w:t xml:space="preserve"> allows a function to accept </w:t>
+      </w:r>
+      <w:r>
+        <w:rPr>
+          <w:rFonts w:ascii="Times New Roman" w:hAnsi="Times New Roman" w:cs="Times New Roman"/>
+          <w:b/>
+          <w:bCs/>
+          <w:sz w:val="24"/>
+          <w:szCs w:val="24"/>
+        </w:rPr>
+        <w:t>any number of positional arguments</w:t>
+      </w:r>
+      <w:r>
+        <w:rPr>
+          <w:rFonts w:ascii="Times New Roman" w:hAnsi="Times New Roman" w:cs="Times New Roman"/>
+          <w:sz w:val="24"/>
+          <w:szCs w:val="24"/>
+        </w:rPr>
+        <w:t xml:space="preserve"> (arguments without a name). These arguments are stored as a </w:t>
+      </w:r>
+      <w:r>
+        <w:rPr>
+          <w:rFonts w:ascii="Times New Roman" w:hAnsi="Times New Roman" w:cs="Times New Roman"/>
+          <w:b/>
+          <w:bCs/>
+          <w:sz w:val="24"/>
+          <w:szCs w:val="24"/>
+        </w:rPr>
+        <w:t>tuple</w:t>
+      </w:r>
+      <w:r>
+        <w:rPr>
+          <w:rFonts w:ascii="Times New Roman" w:hAnsi="Times New Roman" w:cs="Times New Roman"/>
+          <w:sz w:val="24"/>
+          <w:szCs w:val="24"/>
+        </w:rPr>
+        <w:t>.</w:t>
+      </w:r>
+    </w:p>
+    <w:p>
+      <w:pPr>
+        <w:rPr>
+          <w:rFonts w:ascii="Times New Roman" w:hAnsi="Times New Roman" w:cs="Times New Roman"/>
+          <w:b/>
+          <w:bCs/>
+          <w:sz w:val="24"/>
+          <w:szCs w:val="24"/>
+        </w:rPr>
+      </w:pPr>
+      <w:r>
+        <w:rPr>
+          <w:rFonts w:ascii="Times New Roman" w:hAnsi="Times New Roman" w:cs="Times New Roman"/>
+          <w:b/>
+          <w:bCs/>
+          <w:sz w:val="24"/>
+          <w:szCs w:val="24"/>
+        </w:rPr>
+        <w:t>Example: Using *</w:t>
+      </w:r>
+      <w:proofErr w:type="spellStart"/>
+      <w:r>
+        <w:rPr>
+          <w:rFonts w:ascii="Times New Roman" w:hAnsi="Times New Roman" w:cs="Times New Roman"/>
+          <w:b/>
+          <w:bCs/>
+          <w:sz w:val="24"/>
+          <w:szCs w:val="24"/>
+        </w:rPr>
+        <w:t>args</w:t>
+      </w:r>
+      <w:proofErr w:type="spellEnd"/>
+    </w:p>
+    <w:p>
+      <w:pPr>
+        <w:rPr>
+          <w:rFonts w:ascii="Times New Roman" w:hAnsi="Times New Roman" w:cs="Times New Roman"/>
+          <w:sz w:val="24"/>
+          <w:szCs w:val="24"/>
+        </w:rPr>
+      </w:pPr>
+      <w:r>
+        <w:rPr>
+          <w:rFonts w:ascii="Times New Roman" w:hAnsi="Times New Roman" w:cs="Times New Roman"/>
+          <w:sz w:val="24"/>
+          <w:szCs w:val="24"/>
+        </w:rPr>
+        <w:t xml:space="preserve">def </w:t>
+      </w:r>
+      <w:proofErr w:type="spellStart"/>
+      <w:r>
+        <w:rPr>
+          <w:rFonts w:ascii="Times New Roman" w:hAnsi="Times New Roman" w:cs="Times New Roman"/>
+          <w:sz w:val="24"/>
+          <w:szCs w:val="24"/>
+        </w:rPr>
+        <w:t>add_numbers</w:t>
+      </w:r>
+      <w:proofErr w:type="spellEnd"/>
+      <w:r>
+        <w:rPr>
+          <w:rFonts w:ascii="Times New Roman" w:hAnsi="Times New Roman" w:cs="Times New Roman"/>
+          <w:sz w:val="24"/>
+          <w:szCs w:val="24"/>
+        </w:rPr>
+        <w:t>(*</w:t>
+      </w:r>
+      <w:proofErr w:type="spellStart"/>
+      <w:r>
+        <w:rPr>
+          <w:rFonts w:ascii="Times New Roman" w:hAnsi="Times New Roman" w:cs="Times New Roman"/>
+          <w:sz w:val="24"/>
+          <w:szCs w:val="24"/>
+        </w:rPr>
+        <w:t>args</w:t>
+      </w:r>
+      <w:proofErr w:type="spellEnd"/>
+      <w:r>
+        <w:rPr>
+          <w:rFonts w:ascii="Times New Roman" w:hAnsi="Times New Roman" w:cs="Times New Roman"/>
+          <w:sz w:val="24"/>
+          <w:szCs w:val="24"/>
+        </w:rPr>
+        <w:t>):</w:t>
+      </w:r>
+    </w:p>
+    <w:p>
+      <w:pPr>
+        <w:rPr>
+          <w:rFonts w:ascii="Times New Roman" w:hAnsi="Times New Roman" w:cs="Times New Roman"/>
+          <w:sz w:val="24"/>
+          <w:szCs w:val="24"/>
+        </w:rPr>
+      </w:pPr>
+      <w:r>
+        <w:rPr>
+          <w:rFonts w:ascii="Times New Roman" w:hAnsi="Times New Roman" w:cs="Times New Roman"/>
+          <w:sz w:val="24"/>
+          <w:szCs w:val="24"/>
+        </w:rPr>
+        <w:t xml:space="preserve">    print(</w:t>
+      </w:r>
+      <w:proofErr w:type="spellStart"/>
+      <w:r>
+        <w:rPr>
+          <w:rFonts w:ascii="Times New Roman" w:hAnsi="Times New Roman" w:cs="Times New Roman"/>
+          <w:sz w:val="24"/>
+          <w:szCs w:val="24"/>
+        </w:rPr>
+        <w:t>args</w:t>
+      </w:r>
+      <w:proofErr w:type="spellEnd"/>
+      <w:r>
+        <w:rPr>
+          <w:rFonts w:ascii="Times New Roman" w:hAnsi="Times New Roman" w:cs="Times New Roman"/>
+          <w:sz w:val="24"/>
+          <w:szCs w:val="24"/>
+        </w:rPr>
+        <w:t xml:space="preserve">)  # </w:t>
+      </w:r>
+      <w:proofErr w:type="spellStart"/>
+      <w:r>
+        <w:rPr>
+          <w:rFonts w:ascii="Times New Roman" w:hAnsi="Times New Roman" w:cs="Times New Roman"/>
+          <w:sz w:val="24"/>
+          <w:szCs w:val="24"/>
+        </w:rPr>
+        <w:t>args</w:t>
+      </w:r>
+      <w:proofErr w:type="spellEnd"/>
+      <w:r>
+        <w:rPr>
+          <w:rFonts w:ascii="Times New Roman" w:hAnsi="Times New Roman" w:cs="Times New Roman"/>
+          <w:sz w:val="24"/>
+          <w:szCs w:val="24"/>
+        </w:rPr>
+        <w:t xml:space="preserve"> is a tuple</w:t>
+      </w:r>
+    </w:p>
+    <w:p>
+      <w:pPr>
+        <w:rPr>
+          <w:rFonts w:ascii="Times New Roman" w:hAnsi="Times New Roman" w:cs="Times New Roman"/>
+          <w:sz w:val="24"/>
+          <w:szCs w:val="24"/>
+        </w:rPr>
+      </w:pPr>
+      <w:r>
+        <w:rPr>
+          <w:rFonts w:ascii="Times New Roman" w:hAnsi="Times New Roman" w:cs="Times New Roman"/>
+          <w:sz w:val="24"/>
+          <w:szCs w:val="24"/>
+        </w:rPr>
+        <w:t xml:space="preserve">    return sum(</w:t>
+      </w:r>
+      <w:proofErr w:type="spellStart"/>
+      <w:r>
+        <w:rPr>
+          <w:rFonts w:ascii="Times New Roman" w:hAnsi="Times New Roman" w:cs="Times New Roman"/>
+          <w:sz w:val="24"/>
+          <w:szCs w:val="24"/>
+        </w:rPr>
+        <w:t>args</w:t>
+      </w:r>
+      <w:proofErr w:type="spellEnd"/>
+      <w:r>
+        <w:rPr>
+          <w:rFonts w:ascii="Times New Roman" w:hAnsi="Times New Roman" w:cs="Times New Roman"/>
+          <w:sz w:val="24"/>
+          <w:szCs w:val="24"/>
+        </w:rPr>
+        <w:t xml:space="preserve">)  # Adds all numbers in </w:t>
+      </w:r>
+      <w:proofErr w:type="spellStart"/>
+      <w:r>
+        <w:rPr>
+          <w:rFonts w:ascii="Times New Roman" w:hAnsi="Times New Roman" w:cs="Times New Roman"/>
+          <w:sz w:val="24"/>
+          <w:szCs w:val="24"/>
+        </w:rPr>
+        <w:t>args</w:t>
+      </w:r>
+      <w:proofErr w:type="spellEnd"/>
+    </w:p>
+    <w:p>
+      <w:pPr>
+        <w:rPr>
+          <w:rFonts w:ascii="Times New Roman" w:hAnsi="Times New Roman" w:cs="Times New Roman"/>
+          <w:sz w:val="24"/>
+          <w:szCs w:val="24"/>
+        </w:rPr>
+      </w:pPr>
+    </w:p>
+    <w:p>
+      <w:pPr>
+        <w:rPr>
+          <w:rFonts w:ascii="Times New Roman" w:hAnsi="Times New Roman" w:cs="Times New Roman"/>
+          <w:sz w:val="24"/>
+          <w:szCs w:val="24"/>
+        </w:rPr>
+      </w:pPr>
+      <w:r>
+        <w:rPr>
+          <w:rFonts w:ascii="Times New Roman" w:hAnsi="Times New Roman" w:cs="Times New Roman"/>
+          <w:sz w:val="24"/>
+          <w:szCs w:val="24"/>
+        </w:rPr>
+        <w:t>print(</w:t>
+      </w:r>
+      <w:proofErr w:type="spellStart"/>
+      <w:r>
+        <w:rPr>
+          <w:rFonts w:ascii="Times New Roman" w:hAnsi="Times New Roman" w:cs="Times New Roman"/>
+          <w:sz w:val="24"/>
+          <w:szCs w:val="24"/>
+        </w:rPr>
+        <w:t>add_numbers</w:t>
+      </w:r>
+      <w:proofErr w:type="spellEnd"/>
+      <w:r>
+        <w:rPr>
+          <w:rFonts w:ascii="Times New Roman" w:hAnsi="Times New Roman" w:cs="Times New Roman"/>
+          <w:sz w:val="24"/>
+          <w:szCs w:val="24"/>
+        </w:rPr>
+        <w:t>(1, 2, 3, 4))  # Output: 10</w:t>
+      </w:r>
+    </w:p>
+    <w:p>
+      <w:pPr>
+        <w:rPr>
+          <w:rFonts w:ascii="Times New Roman" w:hAnsi="Times New Roman" w:cs="Times New Roman"/>
+          <w:sz w:val="24"/>
+          <w:szCs w:val="24"/>
+        </w:rPr>
+      </w:pPr>
+      <w:r>
+        <w:rPr>
+          <w:rFonts w:ascii="Times New Roman" w:hAnsi="Times New Roman" w:cs="Times New Roman"/>
+          <w:sz w:val="24"/>
+          <w:szCs w:val="24"/>
+        </w:rPr>
+        <w:t>print(</w:t>
+      </w:r>
+      <w:proofErr w:type="spellStart"/>
+      <w:r>
+        <w:rPr>
+          <w:rFonts w:ascii="Times New Roman" w:hAnsi="Times New Roman" w:cs="Times New Roman"/>
+          <w:sz w:val="24"/>
+          <w:szCs w:val="24"/>
+        </w:rPr>
+        <w:t>add_numbers</w:t>
+      </w:r>
+      <w:proofErr w:type="spellEnd"/>
+      <w:r>
+        <w:rPr>
+          <w:rFonts w:ascii="Times New Roman" w:hAnsi="Times New Roman" w:cs="Times New Roman"/>
+          <w:sz w:val="24"/>
+          <w:szCs w:val="24"/>
+        </w:rPr>
+        <w:t>(10, 20))      # Output: 30</w:t>
+      </w:r>
+    </w:p>
+    <w:p>
+      <w:pPr>
+        <w:rPr>
+          <w:rFonts w:ascii="Times New Roman" w:hAnsi="Times New Roman" w:cs="Times New Roman"/>
+          <w:b/>
+          <w:bCs/>
+          <w:sz w:val="24"/>
+          <w:szCs w:val="24"/>
+        </w:rPr>
+      </w:pPr>
+      <w:r>
+        <w:rPr>
+          <w:rFonts w:ascii="Times New Roman" w:hAnsi="Times New Roman" w:cs="Times New Roman"/>
+          <w:b/>
+          <w:bCs/>
+          <w:sz w:val="24"/>
+          <w:szCs w:val="24"/>
+        </w:rPr>
+        <w:t>How It Works</w:t>
+      </w:r>
+    </w:p>
+    <w:p>
+      <w:pPr>
+        <w:numPr>
+          <w:ilvl w:val="0"/>
+          <w:numId w:val="1"/>
+        </w:numPr>
+        <w:rPr>
+          <w:rFonts w:ascii="Times New Roman" w:hAnsi="Times New Roman" w:cs="Times New Roman"/>
+          <w:sz w:val="24"/>
+          <w:szCs w:val="24"/>
+        </w:rPr>
+      </w:pPr>
+      <w:r>
+        <w:rPr>
+          <w:rFonts w:ascii="Times New Roman" w:hAnsi="Times New Roman" w:cs="Times New Roman"/>
+          <w:sz w:val="24"/>
+          <w:szCs w:val="24"/>
+        </w:rPr>
+        <w:t xml:space="preserve">When calling </w:t>
+      </w:r>
+      <w:proofErr w:type="spellStart"/>
+      <w:r>
+        <w:rPr>
+          <w:rFonts w:ascii="Times New Roman" w:hAnsi="Times New Roman" w:cs="Times New Roman"/>
+          <w:sz w:val="24"/>
+          <w:szCs w:val="24"/>
+        </w:rPr>
+        <w:t>add_numbers</w:t>
+      </w:r>
+      <w:proofErr w:type="spellEnd"/>
+      <w:r>
+        <w:rPr>
+          <w:rFonts w:ascii="Times New Roman" w:hAnsi="Times New Roman" w:cs="Times New Roman"/>
+          <w:sz w:val="24"/>
+          <w:szCs w:val="24"/>
+        </w:rPr>
+        <w:t>(1, 2, 3, 4), the function receives (1, 2, 3, 4) as a tuple.</w:t>
+      </w:r>
+    </w:p>
+    <w:p>
+      <w:pPr>
+        <w:numPr>
+          <w:ilvl w:val="0"/>
+          <w:numId w:val="1"/>
+        </w:numPr>
+        <w:rPr>
+          <w:rFonts w:ascii="Times New Roman" w:hAnsi="Times New Roman" w:cs="Times New Roman"/>
+          <w:sz w:val="24"/>
+          <w:szCs w:val="24"/>
+        </w:rPr>
+      </w:pPr>
+      <w:r>
+        <w:rPr>
+          <w:rFonts w:ascii="Times New Roman" w:hAnsi="Times New Roman" w:cs="Times New Roman"/>
+          <w:sz w:val="24"/>
+          <w:szCs w:val="24"/>
+        </w:rPr>
+        <w:t>sum(</w:t>
+      </w:r>
+      <w:proofErr w:type="spellStart"/>
+      <w:r>
+        <w:rPr>
+          <w:rFonts w:ascii="Times New Roman" w:hAnsi="Times New Roman" w:cs="Times New Roman"/>
+          <w:sz w:val="24"/>
+          <w:szCs w:val="24"/>
+        </w:rPr>
+        <w:t>args</w:t>
+      </w:r>
+      <w:proofErr w:type="spellEnd"/>
+      <w:r>
+        <w:rPr>
+          <w:rFonts w:ascii="Times New Roman" w:hAnsi="Times New Roman" w:cs="Times New Roman"/>
+          <w:sz w:val="24"/>
+          <w:szCs w:val="24"/>
+        </w:rPr>
+        <w:t>) adds all numbers together.</w:t>
+      </w:r>
+    </w:p>
+    <w:p>
+      <w:pPr>
+        <w:rPr>
+          <w:rFonts w:ascii="Times New Roman" w:hAnsi="Times New Roman" w:cs="Times New Roman"/>
+          <w:b/>
+          <w:bCs/>
+          <w:sz w:val="24"/>
+          <w:szCs w:val="24"/>
+        </w:rPr>
+      </w:pPr>
+      <w:r>
+        <w:rPr>
+          <w:rFonts w:ascii="Times New Roman" w:hAnsi="Times New Roman" w:cs="Times New Roman"/>
+          <w:b/>
+          <w:bCs/>
+          <w:sz w:val="24"/>
+          <w:szCs w:val="24"/>
+        </w:rPr>
+        <w:t>Behind the Scenes:</w:t>
+      </w:r>
+    </w:p>
+    <w:p>
+      <w:pPr>
+        <w:rPr>
+          <w:rFonts w:ascii="Times New Roman" w:hAnsi="Times New Roman" w:cs="Times New Roman"/>
+          <w:sz w:val="24"/>
+          <w:szCs w:val="24"/>
+        </w:rPr>
+      </w:pPr>
+      <w:r>
+        <w:rPr>
+          <w:rFonts w:ascii="Times New Roman" w:hAnsi="Times New Roman" w:cs="Times New Roman"/>
+          <w:sz w:val="24"/>
+          <w:szCs w:val="24"/>
+        </w:rPr>
+        <w:t>python</w:t>
+      </w:r>
+    </w:p>
+    <w:p>
+      <w:pPr>
+        <w:rPr>
+          <w:rFonts w:ascii="Times New Roman" w:hAnsi="Times New Roman" w:cs="Times New Roman"/>
+          <w:sz w:val="24"/>
+          <w:szCs w:val="24"/>
+        </w:rPr>
+      </w:pPr>
+      <w:proofErr w:type="spellStart"/>
+      <w:r>
+        <w:rPr>
+          <w:rFonts w:ascii="Times New Roman" w:hAnsi="Times New Roman" w:cs="Times New Roman"/>
+          <w:sz w:val="24"/>
+          <w:szCs w:val="24"/>
+        </w:rPr>
+        <w:t>CopyEdit</w:t>
+      </w:r>
+      <w:proofErr w:type="spellEnd"/>
+    </w:p>
+    <w:p>
+      <w:pPr>
+        <w:rPr>
+          <w:rFonts w:ascii="Times New Roman" w:hAnsi="Times New Roman" w:cs="Times New Roman"/>
+          <w:sz w:val="24"/>
+          <w:szCs w:val="24"/>
+        </w:rPr>
+      </w:pPr>
+      <w:r>
+        <w:rPr>
+          <w:rFonts w:ascii="Times New Roman" w:hAnsi="Times New Roman" w:cs="Times New Roman"/>
+          <w:sz w:val="24"/>
+          <w:szCs w:val="24"/>
+        </w:rPr>
+        <w:t xml:space="preserve">def </w:t>
+      </w:r>
+      <w:proofErr w:type="spellStart"/>
+      <w:r>
+        <w:rPr>
+          <w:rFonts w:ascii="Times New Roman" w:hAnsi="Times New Roman" w:cs="Times New Roman"/>
+          <w:sz w:val="24"/>
+          <w:szCs w:val="24"/>
+        </w:rPr>
+        <w:t>add_numbers</w:t>
+      </w:r>
+      <w:proofErr w:type="spellEnd"/>
+      <w:r>
+        <w:rPr>
+          <w:rFonts w:ascii="Times New Roman" w:hAnsi="Times New Roman" w:cs="Times New Roman"/>
+          <w:sz w:val="24"/>
+          <w:szCs w:val="24"/>
+        </w:rPr>
+        <w:t>(*</w:t>
+      </w:r>
+      <w:proofErr w:type="spellStart"/>
+      <w:r>
+        <w:rPr>
+          <w:rFonts w:ascii="Times New Roman" w:hAnsi="Times New Roman" w:cs="Times New Roman"/>
+          <w:sz w:val="24"/>
+          <w:szCs w:val="24"/>
+        </w:rPr>
+        <w:t>args</w:t>
+      </w:r>
+      <w:proofErr w:type="spellEnd"/>
+      <w:r>
+        <w:rPr>
+          <w:rFonts w:ascii="Times New Roman" w:hAnsi="Times New Roman" w:cs="Times New Roman"/>
+          <w:sz w:val="24"/>
+          <w:szCs w:val="24"/>
+        </w:rPr>
+        <w:t>):</w:t>
+      </w:r>
+    </w:p>
+    <w:p>
+      <w:pPr>
+        <w:rPr>
+          <w:rFonts w:ascii="Times New Roman" w:hAnsi="Times New Roman" w:cs="Times New Roman"/>
+          <w:sz w:val="24"/>
+          <w:szCs w:val="24"/>
+        </w:rPr>
+      </w:pPr>
+      <w:r>
+        <w:rPr>
+          <w:rFonts w:ascii="Times New Roman" w:hAnsi="Times New Roman" w:cs="Times New Roman"/>
+          <w:sz w:val="24"/>
+          <w:szCs w:val="24"/>
+        </w:rPr>
+        <w:t xml:space="preserve">    print("</w:t>
+      </w:r>
+      <w:proofErr w:type="spellStart"/>
+      <w:r>
+        <w:rPr>
+          <w:rFonts w:ascii="Times New Roman" w:hAnsi="Times New Roman" w:cs="Times New Roman"/>
+          <w:sz w:val="24"/>
+          <w:szCs w:val="24"/>
+        </w:rPr>
+        <w:t>Args</w:t>
+      </w:r>
+      <w:proofErr w:type="spellEnd"/>
+      <w:r>
+        <w:rPr>
+          <w:rFonts w:ascii="Times New Roman" w:hAnsi="Times New Roman" w:cs="Times New Roman"/>
+          <w:sz w:val="24"/>
+          <w:szCs w:val="24"/>
+        </w:rPr>
+        <w:t xml:space="preserve"> received:", </w:t>
+      </w:r>
+      <w:proofErr w:type="spellStart"/>
+      <w:r>
+        <w:rPr>
+          <w:rFonts w:ascii="Times New Roman" w:hAnsi="Times New Roman" w:cs="Times New Roman"/>
+          <w:sz w:val="24"/>
+          <w:szCs w:val="24"/>
+        </w:rPr>
+        <w:t>args</w:t>
+      </w:r>
+      <w:proofErr w:type="spellEnd"/>
+      <w:r>
+        <w:rPr>
+          <w:rFonts w:ascii="Times New Roman" w:hAnsi="Times New Roman" w:cs="Times New Roman"/>
+          <w:sz w:val="24"/>
+          <w:szCs w:val="24"/>
+        </w:rPr>
+        <w:t>)</w:t>
+      </w:r>
+    </w:p>
+    <w:p>
+      <w:pPr>
+        <w:rPr>
+          <w:rFonts w:ascii="Times New Roman" w:hAnsi="Times New Roman" w:cs="Times New Roman"/>
+          <w:sz w:val="24"/>
+          <w:szCs w:val="24"/>
+        </w:rPr>
+      </w:pPr>
+    </w:p>
+    <w:p>
+      <w:pPr>
+        <w:rPr>
+          <w:rFonts w:ascii="Times New Roman" w:hAnsi="Times New Roman" w:cs="Times New Roman"/>
+          <w:sz w:val="24"/>
+          <w:szCs w:val="24"/>
+        </w:rPr>
+      </w:pPr>
+      <w:proofErr w:type="spellStart"/>
+      <w:r>
+        <w:rPr>
+          <w:rFonts w:ascii="Times New Roman" w:hAnsi="Times New Roman" w:cs="Times New Roman"/>
+          <w:sz w:val="24"/>
+          <w:szCs w:val="24"/>
+        </w:rPr>
+        <w:t>add_numbers</w:t>
+      </w:r>
+      <w:proofErr w:type="spellEnd"/>
+      <w:r>
+        <w:rPr>
+          <w:rFonts w:ascii="Times New Roman" w:hAnsi="Times New Roman" w:cs="Times New Roman"/>
+          <w:sz w:val="24"/>
+          <w:szCs w:val="24"/>
+        </w:rPr>
+        <w:t xml:space="preserve">(1, 2, 3)  </w:t>
+      </w:r>
+    </w:p>
+    <w:p>
+      <w:pPr>
+        <w:rPr>
+          <w:rFonts w:ascii="Times New Roman" w:hAnsi="Times New Roman" w:cs="Times New Roman"/>
+          <w:sz w:val="24"/>
+          <w:szCs w:val="24"/>
+        </w:rPr>
+      </w:pPr>
+      <w:r>
+        <w:rPr>
+          <w:rFonts w:ascii="Times New Roman" w:hAnsi="Times New Roman" w:cs="Times New Roman"/>
+          <w:b/>
+          <w:bCs/>
+          <w:sz w:val="24"/>
+          <w:szCs w:val="24"/>
+        </w:rPr>
+        <w:t>Output:</w:t>
+      </w:r>
+    </w:p>
+    <w:p>
+      <w:pPr>
+        <w:rPr>
+          <w:rFonts w:ascii="Times New Roman" w:hAnsi="Times New Roman" w:cs="Times New Roman"/>
+          <w:sz w:val="24"/>
+          <w:szCs w:val="24"/>
+        </w:rPr>
+      </w:pPr>
+      <w:proofErr w:type="spellStart"/>
+      <w:r>
+        <w:rPr>
+          <w:rFonts w:ascii="Times New Roman" w:hAnsi="Times New Roman" w:cs="Times New Roman"/>
+          <w:sz w:val="24"/>
+          <w:szCs w:val="24"/>
+        </w:rPr>
+        <w:lastRenderedPageBreak/>
+        <w:t>yaml</w:t>
+      </w:r>
+      <w:proofErr w:type="spellEnd"/>
+    </w:p>
+    <w:p>
+      <w:pPr>
+        <w:rPr>
+          <w:rFonts w:ascii="Times New Roman" w:hAnsi="Times New Roman" w:cs="Times New Roman"/>
+          <w:sz w:val="24"/>
+          <w:szCs w:val="24"/>
+        </w:rPr>
+      </w:pPr>
+      <w:proofErr w:type="spellStart"/>
+      <w:r>
+        <w:rPr>
+          <w:rFonts w:ascii="Times New Roman" w:hAnsi="Times New Roman" w:cs="Times New Roman"/>
+          <w:sz w:val="24"/>
+          <w:szCs w:val="24"/>
+        </w:rPr>
+        <w:t>CopyEdit</w:t>
+      </w:r>
+      <w:proofErr w:type="spellEnd"/>
+    </w:p>
+    <w:p>
+      <w:pPr>
+        <w:rPr>
+          <w:rFonts w:ascii="Times New Roman" w:hAnsi="Times New Roman" w:cs="Times New Roman"/>
+          <w:sz w:val="24"/>
+          <w:szCs w:val="24"/>
+        </w:rPr>
+      </w:pPr>
+      <w:proofErr w:type="spellStart"/>
+      <w:r>
+        <w:rPr>
+          <w:rFonts w:ascii="Times New Roman" w:hAnsi="Times New Roman" w:cs="Times New Roman"/>
+          <w:sz w:val="24"/>
+          <w:szCs w:val="24"/>
+        </w:rPr>
+        <w:t>Args</w:t>
+      </w:r>
+      <w:proofErr w:type="spellEnd"/>
+      <w:r>
+        <w:rPr>
+          <w:rFonts w:ascii="Times New Roman" w:hAnsi="Times New Roman" w:cs="Times New Roman"/>
+          <w:sz w:val="24"/>
+          <w:szCs w:val="24"/>
+        </w:rPr>
+        <w:t xml:space="preserve"> received: (1, 2, 3)</w:t>
+      </w:r>
+    </w:p>
+    <w:p>
+      <w:pPr>
+        <w:rPr>
+          <w:rFonts w:ascii="Times New Roman" w:hAnsi="Times New Roman" w:cs="Times New Roman"/>
+          <w:sz w:val="24"/>
+          <w:szCs w:val="24"/>
+        </w:rPr>
+      </w:pPr>
+      <w:r>
+        <w:rPr>
+          <w:rFonts w:ascii="Times New Roman" w:hAnsi="Times New Roman" w:cs="Times New Roman"/>
+          <w:sz w:val="24"/>
+          <w:szCs w:val="24"/>
+        </w:rPr>
+        <w:pict w14:anchorId="5E9D11AE">
+          <v:rect id="_x0000_i1068" style="width:0;height:1.5pt" o:hralign="center" o:hrstd="t" o:hr="t" fillcolor="#a0a0a0" stroked="f"/>
+        </w:pict>
+      </w:r>
+    </w:p>
+    <w:p>
+      <w:pPr>
+        <w:rPr>
+          <w:rFonts w:ascii="Times New Roman" w:hAnsi="Times New Roman" w:cs="Times New Roman"/>
+          <w:b/>
+          <w:bCs/>
+          <w:sz w:val="24"/>
+          <w:szCs w:val="24"/>
+        </w:rPr>
+      </w:pPr>
+      <w:r>
+        <w:rPr>
+          <w:rFonts w:ascii="Times New Roman" w:hAnsi="Times New Roman" w:cs="Times New Roman"/>
+          <w:b/>
+          <w:bCs/>
+          <w:sz w:val="24"/>
+          <w:szCs w:val="24"/>
+        </w:rPr>
+        <w:t>2. What is **</w:t>
+      </w:r>
+      <w:proofErr w:type="spellStart"/>
+      <w:r>
+        <w:rPr>
+          <w:rFonts w:ascii="Times New Roman" w:hAnsi="Times New Roman" w:cs="Times New Roman"/>
+          <w:b/>
+          <w:bCs/>
+          <w:sz w:val="24"/>
+          <w:szCs w:val="24"/>
+        </w:rPr>
+        <w:t>kwargs</w:t>
+      </w:r>
+      <w:proofErr w:type="spellEnd"/>
+      <w:r>
+        <w:rPr>
+          <w:rFonts w:ascii="Times New Roman" w:hAnsi="Times New Roman" w:cs="Times New Roman"/>
+          <w:b/>
+          <w:bCs/>
+          <w:sz w:val="24"/>
+          <w:szCs w:val="24"/>
+        </w:rPr>
+        <w:t>?</w:t>
+      </w:r>
+    </w:p>
+    <w:p>
+      <w:pPr>
+        <w:rPr>
+          <w:rFonts w:ascii="Times New Roman" w:hAnsi="Times New Roman" w:cs="Times New Roman"/>
+          <w:sz w:val="24"/>
+          <w:szCs w:val="24"/>
+        </w:rPr>
+      </w:pPr>
+      <w:r>
+        <w:rPr>
+          <w:rFonts w:ascii="Times New Roman" w:hAnsi="Times New Roman" w:cs="Times New Roman"/>
+          <w:sz w:val="24"/>
+          <w:szCs w:val="24"/>
+        </w:rPr>
+        <w:t>**</w:t>
+      </w:r>
+      <w:proofErr w:type="spellStart"/>
+      <w:r>
+        <w:rPr>
+          <w:rFonts w:ascii="Times New Roman" w:hAnsi="Times New Roman" w:cs="Times New Roman"/>
+          <w:sz w:val="24"/>
+          <w:szCs w:val="24"/>
+        </w:rPr>
+        <w:t>kwargs</w:t>
+      </w:r>
+      <w:proofErr w:type="spellEnd"/>
+      <w:r>
+        <w:rPr>
+          <w:rFonts w:ascii="Times New Roman" w:hAnsi="Times New Roman" w:cs="Times New Roman"/>
+          <w:sz w:val="24"/>
+          <w:szCs w:val="24"/>
+        </w:rPr>
+        <w:t xml:space="preserve"> allows a function to accept </w:t>
+      </w:r>
+      <w:r>
+        <w:rPr>
+          <w:rFonts w:ascii="Times New Roman" w:hAnsi="Times New Roman" w:cs="Times New Roman"/>
+          <w:b/>
+          <w:bCs/>
+          <w:sz w:val="24"/>
+          <w:szCs w:val="24"/>
+        </w:rPr>
+        <w:t>any number of keyword arguments</w:t>
+      </w:r>
+      <w:r>
+        <w:rPr>
+          <w:rFonts w:ascii="Times New Roman" w:hAnsi="Times New Roman" w:cs="Times New Roman"/>
+          <w:sz w:val="24"/>
+          <w:szCs w:val="24"/>
+        </w:rPr>
+        <w:t xml:space="preserve"> (named arguments). These arguments are stored as a </w:t>
+      </w:r>
+      <w:r>
+        <w:rPr>
+          <w:rFonts w:ascii="Times New Roman" w:hAnsi="Times New Roman" w:cs="Times New Roman"/>
+          <w:b/>
+          <w:bCs/>
+          <w:sz w:val="24"/>
+          <w:szCs w:val="24"/>
+        </w:rPr>
+        <w:t>dictionary</w:t>
+      </w:r>
+      <w:r>
+        <w:rPr>
+          <w:rFonts w:ascii="Times New Roman" w:hAnsi="Times New Roman" w:cs="Times New Roman"/>
+          <w:sz w:val="24"/>
+          <w:szCs w:val="24"/>
+        </w:rPr>
+        <w:t>.</w:t>
+      </w:r>
+    </w:p>
+    <w:p>
+      <w:pPr>
+        <w:rPr>
+          <w:rFonts w:ascii="Times New Roman" w:hAnsi="Times New Roman" w:cs="Times New Roman"/>
+          <w:b/>
+          <w:bCs/>
+          <w:sz w:val="24"/>
+          <w:szCs w:val="24"/>
+        </w:rPr>
+      </w:pPr>
+      <w:r>
+        <w:rPr>
+          <w:rFonts w:ascii="Times New Roman" w:hAnsi="Times New Roman" w:cs="Times New Roman"/>
+          <w:b/>
+          <w:bCs/>
+          <w:sz w:val="24"/>
+          <w:szCs w:val="24"/>
+        </w:rPr>
+        <w:t>Example: Using **</w:t>
+      </w:r>
+      <w:proofErr w:type="spellStart"/>
+      <w:r>
+        <w:rPr>
+          <w:rFonts w:ascii="Times New Roman" w:hAnsi="Times New Roman" w:cs="Times New Roman"/>
+          <w:b/>
+          <w:bCs/>
+          <w:sz w:val="24"/>
+          <w:szCs w:val="24"/>
+        </w:rPr>
+        <w:t>kwargs</w:t>
+      </w:r>
+      <w:proofErr w:type="spellEnd"/>
+    </w:p>
+    <w:p>
+      <w:pPr>
+        <w:rPr>
+          <w:rFonts w:ascii="Times New Roman" w:hAnsi="Times New Roman" w:cs="Times New Roman"/>
+          <w:sz w:val="24"/>
+          <w:szCs w:val="24"/>
+        </w:rPr>
+      </w:pPr>
+      <w:r>
+        <w:rPr>
+          <w:rFonts w:ascii="Times New Roman" w:hAnsi="Times New Roman" w:cs="Times New Roman"/>
+          <w:sz w:val="24"/>
+          <w:szCs w:val="24"/>
+        </w:rPr>
+        <w:t>python</w:t>
+      </w:r>
+    </w:p>
+    <w:p>
+      <w:pPr>
+        <w:rPr>
+          <w:rFonts w:ascii="Times New Roman" w:hAnsi="Times New Roman" w:cs="Times New Roman"/>
+          <w:sz w:val="24"/>
+          <w:szCs w:val="24"/>
+        </w:rPr>
+      </w:pPr>
+      <w:proofErr w:type="spellStart"/>
+      <w:r>
+        <w:rPr>
+          <w:rFonts w:ascii="Times New Roman" w:hAnsi="Times New Roman" w:cs="Times New Roman"/>
+          <w:sz w:val="24"/>
+          <w:szCs w:val="24"/>
+        </w:rPr>
+        <w:t>CopyEdit</w:t>
+      </w:r>
+      <w:proofErr w:type="spellEnd"/>
+    </w:p>
+    <w:p>
+      <w:pPr>
+        <w:rPr>
+          <w:rFonts w:ascii="Times New Roman" w:hAnsi="Times New Roman" w:cs="Times New Roman"/>
+          <w:sz w:val="24"/>
+          <w:szCs w:val="24"/>
+        </w:rPr>
+      </w:pPr>
+      <w:r>
+        <w:rPr>
+          <w:rFonts w:ascii="Times New Roman" w:hAnsi="Times New Roman" w:cs="Times New Roman"/>
+          <w:sz w:val="24"/>
+          <w:szCs w:val="24"/>
+        </w:rPr>
+        <w:t xml:space="preserve">def </w:t>
+      </w:r>
+      <w:proofErr w:type="spellStart"/>
+      <w:r>
+        <w:rPr>
+          <w:rFonts w:ascii="Times New Roman" w:hAnsi="Times New Roman" w:cs="Times New Roman"/>
+          <w:sz w:val="24"/>
+          <w:szCs w:val="24"/>
+        </w:rPr>
+        <w:t>display_info</w:t>
+      </w:r>
+      <w:proofErr w:type="spellEnd"/>
+      <w:r>
+        <w:rPr>
+          <w:rFonts w:ascii="Times New Roman" w:hAnsi="Times New Roman" w:cs="Times New Roman"/>
+          <w:sz w:val="24"/>
+          <w:szCs w:val="24"/>
+        </w:rPr>
+        <w:t>(**</w:t>
+      </w:r>
+      <w:proofErr w:type="spellStart"/>
+      <w:r>
+        <w:rPr>
+          <w:rFonts w:ascii="Times New Roman" w:hAnsi="Times New Roman" w:cs="Times New Roman"/>
+          <w:sz w:val="24"/>
+          <w:szCs w:val="24"/>
+        </w:rPr>
+        <w:t>kwargs</w:t>
+      </w:r>
+      <w:proofErr w:type="spellEnd"/>
+      <w:r>
+        <w:rPr>
+          <w:rFonts w:ascii="Times New Roman" w:hAnsi="Times New Roman" w:cs="Times New Roman"/>
+          <w:sz w:val="24"/>
+          <w:szCs w:val="24"/>
+        </w:rPr>
+        <w:t>):</w:t>
+      </w:r>
+    </w:p>
+    <w:p>
+      <w:pPr>
+        <w:rPr>
+          <w:rFonts w:ascii="Times New Roman" w:hAnsi="Times New Roman" w:cs="Times New Roman"/>
+          <w:sz w:val="24"/>
+          <w:szCs w:val="24"/>
+        </w:rPr>
+      </w:pPr>
+      <w:r>
+        <w:rPr>
+          <w:rFonts w:ascii="Times New Roman" w:hAnsi="Times New Roman" w:cs="Times New Roman"/>
+          <w:sz w:val="24"/>
+          <w:szCs w:val="24"/>
+        </w:rPr>
+        <w:t xml:space="preserve">    print(</w:t>
+      </w:r>
+      <w:proofErr w:type="spellStart"/>
+      <w:r>
+        <w:rPr>
+          <w:rFonts w:ascii="Times New Roman" w:hAnsi="Times New Roman" w:cs="Times New Roman"/>
+          <w:sz w:val="24"/>
+          <w:szCs w:val="24"/>
+        </w:rPr>
+        <w:t>kwargs</w:t>
+      </w:r>
+      <w:proofErr w:type="spellEnd"/>
+      <w:r>
+        <w:rPr>
+          <w:rFonts w:ascii="Times New Roman" w:hAnsi="Times New Roman" w:cs="Times New Roman"/>
+          <w:sz w:val="24"/>
+          <w:szCs w:val="24"/>
+        </w:rPr>
+        <w:t xml:space="preserve">)  # </w:t>
+      </w:r>
+      <w:proofErr w:type="spellStart"/>
+      <w:r>
+        <w:rPr>
+          <w:rFonts w:ascii="Times New Roman" w:hAnsi="Times New Roman" w:cs="Times New Roman"/>
+          <w:sz w:val="24"/>
+          <w:szCs w:val="24"/>
+        </w:rPr>
+        <w:t>kwargs</w:t>
+      </w:r>
+      <w:proofErr w:type="spellEnd"/>
+      <w:r>
+        <w:rPr>
+          <w:rFonts w:ascii="Times New Roman" w:hAnsi="Times New Roman" w:cs="Times New Roman"/>
+          <w:sz w:val="24"/>
+          <w:szCs w:val="24"/>
+        </w:rPr>
+        <w:t xml:space="preserve"> is a dictionary</w:t>
+      </w:r>
+    </w:p>
+    <w:p>
+      <w:pPr>
+        <w:rPr>
+          <w:rFonts w:ascii="Times New Roman" w:hAnsi="Times New Roman" w:cs="Times New Roman"/>
+          <w:sz w:val="24"/>
+          <w:szCs w:val="24"/>
+        </w:rPr>
+      </w:pPr>
+      <w:r>
+        <w:rPr>
+          <w:rFonts w:ascii="Times New Roman" w:hAnsi="Times New Roman" w:cs="Times New Roman"/>
+          <w:sz w:val="24"/>
+          <w:szCs w:val="24"/>
+        </w:rPr>
+        <w:t xml:space="preserve">    for key, value in </w:t>
+      </w:r>
+      <w:proofErr w:type="spellStart"/>
+      <w:r>
+        <w:rPr>
+          <w:rFonts w:ascii="Times New Roman" w:hAnsi="Times New Roman" w:cs="Times New Roman"/>
+          <w:sz w:val="24"/>
+          <w:szCs w:val="24"/>
+        </w:rPr>
+        <w:t>kwargs.items</w:t>
+      </w:r>
+      <w:proofErr w:type="spellEnd"/>
+      <w:r>
+        <w:rPr>
+          <w:rFonts w:ascii="Times New Roman" w:hAnsi="Times New Roman" w:cs="Times New Roman"/>
+          <w:sz w:val="24"/>
+          <w:szCs w:val="24"/>
+        </w:rPr>
+        <w:t>():</w:t>
+      </w:r>
+    </w:p>
+    <w:p>
+      <w:pPr>
+        <w:rPr>
+          <w:rFonts w:ascii="Times New Roman" w:hAnsi="Times New Roman" w:cs="Times New Roman"/>
+          <w:sz w:val="24"/>
+          <w:szCs w:val="24"/>
+        </w:rPr>
+      </w:pPr>
+      <w:r>
+        <w:rPr>
+          <w:rFonts w:ascii="Times New Roman" w:hAnsi="Times New Roman" w:cs="Times New Roman"/>
+          <w:sz w:val="24"/>
+          <w:szCs w:val="24"/>
+        </w:rPr>
+        <w:t xml:space="preserve">        print(f"{key}: {value}")</w:t>
+      </w:r>
+    </w:p>
+    <w:p>
+      <w:pPr>
+        <w:rPr>
+          <w:rFonts w:ascii="Times New Roman" w:hAnsi="Times New Roman" w:cs="Times New Roman"/>
+          <w:sz w:val="24"/>
+          <w:szCs w:val="24"/>
+        </w:rPr>
+      </w:pPr>
+    </w:p>
+    <w:p>
+      <w:pPr>
+        <w:rPr>
+          <w:rFonts w:ascii="Times New Roman" w:hAnsi="Times New Roman" w:cs="Times New Roman"/>
+          <w:sz w:val="24"/>
+          <w:szCs w:val="24"/>
+        </w:rPr>
+      </w:pPr>
+      <w:proofErr w:type="spellStart"/>
+      <w:r>
+        <w:rPr>
+          <w:rFonts w:ascii="Times New Roman" w:hAnsi="Times New Roman" w:cs="Times New Roman"/>
+          <w:sz w:val="24"/>
+          <w:szCs w:val="24"/>
+        </w:rPr>
+        <w:t>display_info</w:t>
+      </w:r>
+      <w:proofErr w:type="spellEnd"/>
+      <w:r>
+        <w:rPr>
+          <w:rFonts w:ascii="Times New Roman" w:hAnsi="Times New Roman" w:cs="Times New Roman"/>
+          <w:sz w:val="24"/>
+          <w:szCs w:val="24"/>
+        </w:rPr>
+        <w:t>(name="Ali", age=21, city="Bangalore")</w:t>
+      </w:r>
+    </w:p>
+    <w:p>
+      <w:pPr>
+        <w:rPr>
+          <w:rFonts w:ascii="Times New Roman" w:hAnsi="Times New Roman" w:cs="Times New Roman"/>
+          <w:b/>
+          <w:bCs/>
+          <w:sz w:val="24"/>
+          <w:szCs w:val="24"/>
+        </w:rPr>
+      </w:pPr>
+      <w:r>
+        <w:rPr>
+          <w:rFonts w:ascii="Times New Roman" w:hAnsi="Times New Roman" w:cs="Times New Roman"/>
+          <w:b/>
+          <w:bCs/>
+          <w:sz w:val="24"/>
+          <w:szCs w:val="24"/>
+        </w:rPr>
+        <w:t>How It Works</w:t>
+      </w:r>
+    </w:p>
+    <w:p>
+      <w:pPr>
+        <w:numPr>
+          <w:ilvl w:val="0"/>
+          <w:numId w:val="2"/>
+        </w:numPr>
+        <w:rPr>
+          <w:rFonts w:ascii="Times New Roman" w:hAnsi="Times New Roman" w:cs="Times New Roman"/>
+          <w:sz w:val="24"/>
+          <w:szCs w:val="24"/>
+        </w:rPr>
+      </w:pPr>
+      <w:proofErr w:type="spellStart"/>
+      <w:r>
+        <w:rPr>
+          <w:rFonts w:ascii="Times New Roman" w:hAnsi="Times New Roman" w:cs="Times New Roman"/>
+          <w:sz w:val="24"/>
+          <w:szCs w:val="24"/>
+        </w:rPr>
+        <w:t>display_info</w:t>
+      </w:r>
+      <w:proofErr w:type="spellEnd"/>
+      <w:r>
+        <w:rPr>
+          <w:rFonts w:ascii="Times New Roman" w:hAnsi="Times New Roman" w:cs="Times New Roman"/>
+          <w:sz w:val="24"/>
+          <w:szCs w:val="24"/>
+        </w:rPr>
+        <w:t>(name="Ali", age=21, city="Bangalore") receives {'name': 'Ali', 'age': 21, 'city': 'Bangalore'} as a dictionary.</w:t>
+      </w:r>
+    </w:p>
+    <w:p>
+      <w:pPr>
+        <w:numPr>
+          <w:ilvl w:val="0"/>
+          <w:numId w:val="2"/>
+        </w:numPr>
+        <w:rPr>
+          <w:rFonts w:ascii="Times New Roman" w:hAnsi="Times New Roman" w:cs="Times New Roman"/>
+          <w:sz w:val="24"/>
+          <w:szCs w:val="24"/>
+        </w:rPr>
+      </w:pPr>
+      <w:r>
+        <w:rPr>
+          <w:rFonts w:ascii="Times New Roman" w:hAnsi="Times New Roman" w:cs="Times New Roman"/>
+          <w:sz w:val="24"/>
+          <w:szCs w:val="24"/>
+        </w:rPr>
+        <w:t xml:space="preserve">The function loops through </w:t>
+      </w:r>
+      <w:proofErr w:type="spellStart"/>
+      <w:r>
+        <w:rPr>
+          <w:rFonts w:ascii="Times New Roman" w:hAnsi="Times New Roman" w:cs="Times New Roman"/>
+          <w:sz w:val="24"/>
+          <w:szCs w:val="24"/>
+        </w:rPr>
+        <w:t>kwargs.items</w:t>
+      </w:r>
+      <w:proofErr w:type="spellEnd"/>
+      <w:r>
+        <w:rPr>
+          <w:rFonts w:ascii="Times New Roman" w:hAnsi="Times New Roman" w:cs="Times New Roman"/>
+          <w:sz w:val="24"/>
+          <w:szCs w:val="24"/>
+        </w:rPr>
+        <w:t>() to print the keys and values.</w:t>
+      </w:r>
+    </w:p>
+    <w:p>
+      <w:pPr>
+        <w:rPr>
+          <w:rFonts w:ascii="Times New Roman" w:hAnsi="Times New Roman" w:cs="Times New Roman"/>
+          <w:sz w:val="24"/>
+          <w:szCs w:val="24"/>
+        </w:rPr>
+      </w:pPr>
+      <w:r>
+        <w:rPr>
+          <w:rFonts w:ascii="Times New Roman" w:hAnsi="Times New Roman" w:cs="Times New Roman"/>
+          <w:b/>
+          <w:bCs/>
+          <w:sz w:val="24"/>
+          <w:szCs w:val="24"/>
+        </w:rPr>
+        <w:t>Output:</w:t>
+      </w:r>
+    </w:p>
+    <w:p>
+      <w:pPr>
+        <w:rPr>
+          <w:rFonts w:ascii="Times New Roman" w:hAnsi="Times New Roman" w:cs="Times New Roman"/>
+          <w:sz w:val="24"/>
+          <w:szCs w:val="24"/>
+        </w:rPr>
+      </w:pPr>
+      <w:proofErr w:type="spellStart"/>
+      <w:r>
+        <w:rPr>
+          <w:rFonts w:ascii="Times New Roman" w:hAnsi="Times New Roman" w:cs="Times New Roman"/>
+          <w:sz w:val="24"/>
+          <w:szCs w:val="24"/>
+        </w:rPr>
+        <w:t>yaml</w:t>
+      </w:r>
+      <w:proofErr w:type="spellEnd"/>
+    </w:p>
+    <w:p>
+      <w:pPr>
+        <w:rPr>
+          <w:rFonts w:ascii="Times New Roman" w:hAnsi="Times New Roman" w:cs="Times New Roman"/>
+          <w:sz w:val="24"/>
+          <w:szCs w:val="24"/>
+        </w:rPr>
+      </w:pPr>
+      <w:proofErr w:type="spellStart"/>
+      <w:r>
+        <w:rPr>
+          <w:rFonts w:ascii="Times New Roman" w:hAnsi="Times New Roman" w:cs="Times New Roman"/>
+          <w:sz w:val="24"/>
+          <w:szCs w:val="24"/>
+        </w:rPr>
+        <w:t>CopyEdit</w:t>
+      </w:r>
+      <w:proofErr w:type="spellEnd"/>
+    </w:p>
+    <w:p>
+      <w:pPr>
+        <w:rPr>
+          <w:rFonts w:ascii="Times New Roman" w:hAnsi="Times New Roman" w:cs="Times New Roman"/>
+          <w:sz w:val="24"/>
+          <w:szCs w:val="24"/>
+        </w:rPr>
+      </w:pPr>
+      <w:r>
+        <w:rPr>
+          <w:rFonts w:ascii="Times New Roman" w:hAnsi="Times New Roman" w:cs="Times New Roman"/>
+          <w:sz w:val="24"/>
+          <w:szCs w:val="24"/>
+        </w:rPr>
+        <w:t>{'name': 'Ali', 'age': 21, 'city': 'Bangalore'}</w:t>
+      </w:r>
+    </w:p>
+    <w:p>
+      <w:pPr>
+        <w:rPr>
+          <w:rFonts w:ascii="Times New Roman" w:hAnsi="Times New Roman" w:cs="Times New Roman"/>
+          <w:sz w:val="24"/>
+          <w:szCs w:val="24"/>
+        </w:rPr>
+      </w:pPr>
+      <w:r>
+        <w:rPr>
+          <w:rFonts w:ascii="Times New Roman" w:hAnsi="Times New Roman" w:cs="Times New Roman"/>
+          <w:sz w:val="24"/>
+          <w:szCs w:val="24"/>
+        </w:rPr>
+        <w:t>name: Ali</w:t>
+      </w:r>
+    </w:p>
+    <w:p>
+      <w:pPr>
+        <w:rPr>
+          <w:rFonts w:ascii="Times New Roman" w:hAnsi="Times New Roman" w:cs="Times New Roman"/>
+          <w:sz w:val="24"/>
+          <w:szCs w:val="24"/>
+        </w:rPr>
+      </w:pPr>
+      <w:r>
+        <w:rPr>
+          <w:rFonts w:ascii="Times New Roman" w:hAnsi="Times New Roman" w:cs="Times New Roman"/>
+          <w:sz w:val="24"/>
+          <w:szCs w:val="24"/>
+        </w:rPr>
+        <w:t>age: 21</w:t>
+      </w:r>
+    </w:p>
+    <w:p>
+      <w:pPr>
+        <w:rPr>
+          <w:rFonts w:ascii="Times New Roman" w:hAnsi="Times New Roman" w:cs="Times New Roman"/>
+          <w:sz w:val="24"/>
+          <w:szCs w:val="24"/>
+        </w:rPr>
+      </w:pPr>
+      <w:r>
+        <w:rPr>
+          <w:rFonts w:ascii="Times New Roman" w:hAnsi="Times New Roman" w:cs="Times New Roman"/>
+          <w:sz w:val="24"/>
+          <w:szCs w:val="24"/>
+        </w:rPr>
+        <w:t>city: Bangalore</w:t>
+      </w:r>
+    </w:p>
+    <w:p>
+      <w:pPr>
+        <w:rPr>
+          <w:rFonts w:ascii="Times New Roman" w:hAnsi="Times New Roman" w:cs="Times New Roman"/>
+          <w:sz w:val="24"/>
+          <w:szCs w:val="24"/>
+        </w:rPr>
+      </w:pPr>
+      <w:r>
+        <w:rPr>
+          <w:rFonts w:ascii="Times New Roman" w:hAnsi="Times New Roman" w:cs="Times New Roman"/>
+          <w:sz w:val="24"/>
+          <w:szCs w:val="24"/>
+        </w:rPr>
+        <w:pict w14:anchorId="4ABC2AD5">
+          <v:rect id="_x0000_i1069" style="width:0;height:1.5pt" o:hralign="center" o:hrstd="t" o:hr="t" fillcolor="#a0a0a0" stroked="f"/>
+        </w:pict>
+      </w:r>
+    </w:p>
+    <w:p>
+      <w:pPr>
+        <w:rPr>
+          <w:rFonts w:ascii="Times New Roman" w:hAnsi="Times New Roman" w:cs="Times New Roman"/>
+          <w:b/>
+          <w:bCs/>
+          <w:sz w:val="24"/>
+          <w:szCs w:val="24"/>
+        </w:rPr>
+      </w:pPr>
+      <w:r>
+        <w:rPr>
+          <w:rFonts w:ascii="Times New Roman" w:hAnsi="Times New Roman" w:cs="Times New Roman"/>
+          <w:b/>
+          <w:bCs/>
+          <w:sz w:val="24"/>
+          <w:szCs w:val="24"/>
+        </w:rPr>
+        <w:t>3. When to Use *</w:t>
+      </w:r>
+      <w:proofErr w:type="spellStart"/>
+      <w:r>
+        <w:rPr>
+          <w:rFonts w:ascii="Times New Roman" w:hAnsi="Times New Roman" w:cs="Times New Roman"/>
+          <w:b/>
+          <w:bCs/>
+          <w:sz w:val="24"/>
+          <w:szCs w:val="24"/>
+        </w:rPr>
+        <w:t>args</w:t>
+      </w:r>
+      <w:proofErr w:type="spellEnd"/>
+      <w:r>
+        <w:rPr>
+          <w:rFonts w:ascii="Times New Roman" w:hAnsi="Times New Roman" w:cs="Times New Roman"/>
+          <w:b/>
+          <w:bCs/>
+          <w:sz w:val="24"/>
+          <w:szCs w:val="24"/>
+        </w:rPr>
+        <w:t xml:space="preserve"> and **</w:t>
+      </w:r>
+      <w:proofErr w:type="spellStart"/>
+      <w:r>
+        <w:rPr>
+          <w:rFonts w:ascii="Times New Roman" w:hAnsi="Times New Roman" w:cs="Times New Roman"/>
+          <w:b/>
+          <w:bCs/>
+          <w:sz w:val="24"/>
+          <w:szCs w:val="24"/>
+        </w:rPr>
+        <w:t>kwargs</w:t>
+      </w:r>
+      <w:proofErr w:type="spellEnd"/>
+      <w:r>
+        <w:rPr>
+          <w:rFonts w:ascii="Times New Roman" w:hAnsi="Times New Roman" w:cs="Times New Roman"/>
+          <w:b/>
+          <w:bCs/>
+          <w:sz w:val="24"/>
+          <w:szCs w:val="24"/>
+        </w:rPr>
+        <w:t xml:space="preserve"> Together?</w:t>
+      </w:r>
+    </w:p>
+    <w:p>
+      <w:pPr>
+        <w:rPr>
+          <w:rFonts w:ascii="Times New Roman" w:hAnsi="Times New Roman" w:cs="Times New Roman"/>
+          <w:sz w:val="24"/>
+          <w:szCs w:val="24"/>
+        </w:rPr>
+      </w:pPr>
+      <w:r>
+        <w:rPr>
+          <w:rFonts w:ascii="Times New Roman" w:hAnsi="Times New Roman" w:cs="Times New Roman"/>
+          <w:sz w:val="24"/>
+          <w:szCs w:val="24"/>
+        </w:rPr>
+        <w:t>You can use both *</w:t>
+      </w:r>
+      <w:proofErr w:type="spellStart"/>
+      <w:r>
+        <w:rPr>
+          <w:rFonts w:ascii="Times New Roman" w:hAnsi="Times New Roman" w:cs="Times New Roman"/>
+          <w:sz w:val="24"/>
+          <w:szCs w:val="24"/>
+        </w:rPr>
+        <w:t>args</w:t>
+      </w:r>
+      <w:proofErr w:type="spellEnd"/>
+      <w:r>
+        <w:rPr>
+          <w:rFonts w:ascii="Times New Roman" w:hAnsi="Times New Roman" w:cs="Times New Roman"/>
+          <w:sz w:val="24"/>
+          <w:szCs w:val="24"/>
+        </w:rPr>
+        <w:t xml:space="preserve"> and **</w:t>
+      </w:r>
+      <w:proofErr w:type="spellStart"/>
+      <w:r>
+        <w:rPr>
+          <w:rFonts w:ascii="Times New Roman" w:hAnsi="Times New Roman" w:cs="Times New Roman"/>
+          <w:sz w:val="24"/>
+          <w:szCs w:val="24"/>
+        </w:rPr>
+        <w:t>kwargs</w:t>
+      </w:r>
+      <w:proofErr w:type="spellEnd"/>
+      <w:r>
+        <w:rPr>
+          <w:rFonts w:ascii="Times New Roman" w:hAnsi="Times New Roman" w:cs="Times New Roman"/>
+          <w:sz w:val="24"/>
+          <w:szCs w:val="24"/>
+        </w:rPr>
+        <w:t xml:space="preserve"> in the same function to handle </w:t>
+      </w:r>
+      <w:r>
+        <w:rPr>
+          <w:rFonts w:ascii="Times New Roman" w:hAnsi="Times New Roman" w:cs="Times New Roman"/>
+          <w:b/>
+          <w:bCs/>
+          <w:sz w:val="24"/>
+          <w:szCs w:val="24"/>
+        </w:rPr>
+        <w:t>both positional and keyword arguments</w:t>
+      </w:r>
+      <w:r>
+        <w:rPr>
+          <w:rFonts w:ascii="Times New Roman" w:hAnsi="Times New Roman" w:cs="Times New Roman"/>
+          <w:sz w:val="24"/>
+          <w:szCs w:val="24"/>
+        </w:rPr>
+        <w:t>.</w:t>
+      </w:r>
+    </w:p>
+    <w:p>
+      <w:pPr>
+        <w:rPr>
+          <w:rFonts w:ascii="Times New Roman" w:hAnsi="Times New Roman" w:cs="Times New Roman"/>
+          <w:b/>
+          <w:bCs/>
+          <w:sz w:val="24"/>
+          <w:szCs w:val="24"/>
+        </w:rPr>
+      </w:pPr>
+      <w:r>
+        <w:rPr>
+          <w:rFonts w:ascii="Times New Roman" w:hAnsi="Times New Roman" w:cs="Times New Roman"/>
+          <w:b/>
+          <w:bCs/>
+          <w:sz w:val="24"/>
+          <w:szCs w:val="24"/>
+        </w:rPr>
+        <w:t>Example:</w:t>
+      </w:r>
+    </w:p>
+    <w:p>
+      <w:pPr>
+        <w:rPr>
+          <w:rFonts w:ascii="Times New Roman" w:hAnsi="Times New Roman" w:cs="Times New Roman"/>
+          <w:sz w:val="24"/>
+          <w:szCs w:val="24"/>
+        </w:rPr>
+      </w:pPr>
+      <w:r>
+        <w:rPr>
+          <w:rFonts w:ascii="Times New Roman" w:hAnsi="Times New Roman" w:cs="Times New Roman"/>
+          <w:sz w:val="24"/>
+          <w:szCs w:val="24"/>
+        </w:rPr>
+        <w:t>python</w:t>
+      </w:r>
+    </w:p>
+    <w:p>
+      <w:pPr>
+        <w:rPr>
+          <w:rFonts w:ascii="Times New Roman" w:hAnsi="Times New Roman" w:cs="Times New Roman"/>
+          <w:sz w:val="24"/>
+          <w:szCs w:val="24"/>
+        </w:rPr>
+      </w:pPr>
+      <w:proofErr w:type="spellStart"/>
+      <w:r>
+        <w:rPr>
+          <w:rFonts w:ascii="Times New Roman" w:hAnsi="Times New Roman" w:cs="Times New Roman"/>
+          <w:sz w:val="24"/>
+          <w:szCs w:val="24"/>
+        </w:rPr>
+        <w:t>CopyEdit</w:t>
+      </w:r>
+      <w:proofErr w:type="spellEnd"/>
+    </w:p>
+    <w:p>
+      <w:pPr>
+        <w:rPr>
+          <w:rFonts w:ascii="Times New Roman" w:hAnsi="Times New Roman" w:cs="Times New Roman"/>
+          <w:sz w:val="24"/>
+          <w:szCs w:val="24"/>
+        </w:rPr>
+      </w:pPr>
+      <w:r>
+        <w:rPr>
+          <w:rFonts w:ascii="Times New Roman" w:hAnsi="Times New Roman" w:cs="Times New Roman"/>
+          <w:sz w:val="24"/>
+          <w:szCs w:val="24"/>
+        </w:rPr>
+        <w:t xml:space="preserve">def </w:t>
+      </w:r>
+      <w:proofErr w:type="spellStart"/>
+      <w:r>
+        <w:rPr>
+          <w:rFonts w:ascii="Times New Roman" w:hAnsi="Times New Roman" w:cs="Times New Roman"/>
+          <w:sz w:val="24"/>
+          <w:szCs w:val="24"/>
+        </w:rPr>
+        <w:t>person_details</w:t>
+      </w:r>
+      <w:proofErr w:type="spellEnd"/>
+      <w:r>
+        <w:rPr>
+          <w:rFonts w:ascii="Times New Roman" w:hAnsi="Times New Roman" w:cs="Times New Roman"/>
+          <w:sz w:val="24"/>
+          <w:szCs w:val="24"/>
+        </w:rPr>
+        <w:t>(name, *</w:t>
+      </w:r>
+      <w:proofErr w:type="spellStart"/>
+      <w:r>
+        <w:rPr>
+          <w:rFonts w:ascii="Times New Roman" w:hAnsi="Times New Roman" w:cs="Times New Roman"/>
+          <w:sz w:val="24"/>
+          <w:szCs w:val="24"/>
+        </w:rPr>
+        <w:t>args</w:t>
+      </w:r>
+      <w:proofErr w:type="spellEnd"/>
+      <w:r>
+        <w:rPr>
+          <w:rFonts w:ascii="Times New Roman" w:hAnsi="Times New Roman" w:cs="Times New Roman"/>
+          <w:sz w:val="24"/>
+          <w:szCs w:val="24"/>
+        </w:rPr>
+        <w:t>, **</w:t>
+      </w:r>
+      <w:proofErr w:type="spellStart"/>
+      <w:r>
+        <w:rPr>
+          <w:rFonts w:ascii="Times New Roman" w:hAnsi="Times New Roman" w:cs="Times New Roman"/>
+          <w:sz w:val="24"/>
+          <w:szCs w:val="24"/>
+        </w:rPr>
+        <w:t>kwargs</w:t>
+      </w:r>
+      <w:proofErr w:type="spellEnd"/>
+      <w:r>
+        <w:rPr>
+          <w:rFonts w:ascii="Times New Roman" w:hAnsi="Times New Roman" w:cs="Times New Roman"/>
+          <w:sz w:val="24"/>
+          <w:szCs w:val="24"/>
+        </w:rPr>
+        <w:t>):</w:t>
+      </w:r>
+    </w:p>
+    <w:p>
+      <w:pPr>
+        <w:rPr>
+          <w:rFonts w:ascii="Times New Roman" w:hAnsi="Times New Roman" w:cs="Times New Roman"/>
+          <w:sz w:val="24"/>
+          <w:szCs w:val="24"/>
+        </w:rPr>
+      </w:pPr>
+      <w:r>
+        <w:rPr>
+          <w:rFonts w:ascii="Times New Roman" w:hAnsi="Times New Roman" w:cs="Times New Roman"/>
+          <w:sz w:val="24"/>
+          <w:szCs w:val="24"/>
+        </w:rPr>
+        <w:t xml:space="preserve">    print("Name:", name)</w:t>
+      </w:r>
+    </w:p>
+    <w:p>
+      <w:pPr>
+        <w:rPr>
+          <w:rFonts w:ascii="Times New Roman" w:hAnsi="Times New Roman" w:cs="Times New Roman"/>
+          <w:sz w:val="24"/>
+          <w:szCs w:val="24"/>
+        </w:rPr>
+      </w:pPr>
+      <w:r>
+        <w:rPr>
+          <w:rFonts w:ascii="Times New Roman" w:hAnsi="Times New Roman" w:cs="Times New Roman"/>
+          <w:sz w:val="24"/>
+          <w:szCs w:val="24"/>
+        </w:rPr>
+        <w:t xml:space="preserve">    print("Additional Info (Tuple):", </w:t>
+      </w:r>
+      <w:proofErr w:type="spellStart"/>
+      <w:r>
+        <w:rPr>
+          <w:rFonts w:ascii="Times New Roman" w:hAnsi="Times New Roman" w:cs="Times New Roman"/>
+          <w:sz w:val="24"/>
+          <w:szCs w:val="24"/>
+        </w:rPr>
+        <w:t>args</w:t>
+      </w:r>
+      <w:proofErr w:type="spellEnd"/>
+      <w:r>
+        <w:rPr>
+          <w:rFonts w:ascii="Times New Roman" w:hAnsi="Times New Roman" w:cs="Times New Roman"/>
+          <w:sz w:val="24"/>
+          <w:szCs w:val="24"/>
+        </w:rPr>
+        <w:t>)  # Stores extra positional arguments</w:t>
+      </w:r>
+    </w:p>
+    <w:p>
+      <w:pPr>
+        <w:rPr>
+          <w:rFonts w:ascii="Times New Roman" w:hAnsi="Times New Roman" w:cs="Times New Roman"/>
+          <w:sz w:val="24"/>
+          <w:szCs w:val="24"/>
+        </w:rPr>
+      </w:pPr>
+      <w:r>
+        <w:rPr>
+          <w:rFonts w:ascii="Times New Roman" w:hAnsi="Times New Roman" w:cs="Times New Roman"/>
+          <w:sz w:val="24"/>
+          <w:szCs w:val="24"/>
+        </w:rPr>
+        <w:t xml:space="preserve">    print("Details (Dictionary):", </w:t>
+      </w:r>
+      <w:proofErr w:type="spellStart"/>
+      <w:r>
+        <w:rPr>
+          <w:rFonts w:ascii="Times New Roman" w:hAnsi="Times New Roman" w:cs="Times New Roman"/>
+          <w:sz w:val="24"/>
+          <w:szCs w:val="24"/>
+        </w:rPr>
+        <w:t>kwargs</w:t>
+      </w:r>
+      <w:proofErr w:type="spellEnd"/>
+      <w:r>
+        <w:rPr>
+          <w:rFonts w:ascii="Times New Roman" w:hAnsi="Times New Roman" w:cs="Times New Roman"/>
+          <w:sz w:val="24"/>
+          <w:szCs w:val="24"/>
+        </w:rPr>
+        <w:t>)  # Stores extra keyword arguments</w:t>
+      </w:r>
+    </w:p>
+    <w:p>
+      <w:pPr>
+        <w:rPr>
+          <w:rFonts w:ascii="Times New Roman" w:hAnsi="Times New Roman" w:cs="Times New Roman"/>
+          <w:sz w:val="24"/>
+          <w:szCs w:val="24"/>
+        </w:rPr>
+      </w:pPr>
+    </w:p>
+    <w:p>
+      <w:pPr>
+        <w:rPr>
+          <w:rFonts w:ascii="Times New Roman" w:hAnsi="Times New Roman" w:cs="Times New Roman"/>
+          <w:sz w:val="24"/>
+          <w:szCs w:val="24"/>
+        </w:rPr>
+      </w:pPr>
+      <w:proofErr w:type="spellStart"/>
+      <w:r>
+        <w:rPr>
+          <w:rFonts w:ascii="Times New Roman" w:hAnsi="Times New Roman" w:cs="Times New Roman"/>
+          <w:sz w:val="24"/>
+          <w:szCs w:val="24"/>
+        </w:rPr>
+        <w:t>person_details</w:t>
+      </w:r>
+      <w:proofErr w:type="spellEnd"/>
+      <w:r>
+        <w:rPr>
+          <w:rFonts w:ascii="Times New Roman" w:hAnsi="Times New Roman" w:cs="Times New Roman"/>
+          <w:sz w:val="24"/>
+          <w:szCs w:val="24"/>
+        </w:rPr>
+        <w:t>("Ali", 21, "Student", country="India", language="Python")</w:t>
+      </w:r>
+    </w:p>
+    <w:p>
+      <w:pPr>
+        <w:rPr>
+          <w:rFonts w:ascii="Times New Roman" w:hAnsi="Times New Roman" w:cs="Times New Roman"/>
+          <w:b/>
+          <w:bCs/>
+          <w:sz w:val="24"/>
+          <w:szCs w:val="24"/>
+        </w:rPr>
+      </w:pPr>
+      <w:r>
+        <w:rPr>
+          <w:rFonts w:ascii="Times New Roman" w:hAnsi="Times New Roman" w:cs="Times New Roman"/>
+          <w:b/>
+          <w:bCs/>
+          <w:sz w:val="24"/>
+          <w:szCs w:val="24"/>
+        </w:rPr>
+        <w:t>How It Works</w:t>
+      </w:r>
+    </w:p>
+    <w:p>
+      <w:pPr>
+        <w:numPr>
+          <w:ilvl w:val="0"/>
+          <w:numId w:val="3"/>
+        </w:numPr>
+        <w:rPr>
+          <w:rFonts w:ascii="Times New Roman" w:hAnsi="Times New Roman" w:cs="Times New Roman"/>
+          <w:sz w:val="24"/>
+          <w:szCs w:val="24"/>
+        </w:rPr>
+      </w:pPr>
+      <w:r>
+        <w:rPr>
+          <w:rFonts w:ascii="Times New Roman" w:hAnsi="Times New Roman" w:cs="Times New Roman"/>
+          <w:sz w:val="24"/>
+          <w:szCs w:val="24"/>
+        </w:rPr>
+        <w:t>"Ali" is assigned to name.</w:t>
+      </w:r>
+    </w:p>
+    <w:p>
+      <w:pPr>
+        <w:numPr>
+          <w:ilvl w:val="0"/>
+          <w:numId w:val="3"/>
+        </w:numPr>
+        <w:rPr>
+          <w:rFonts w:ascii="Times New Roman" w:hAnsi="Times New Roman" w:cs="Times New Roman"/>
+          <w:sz w:val="24"/>
+          <w:szCs w:val="24"/>
+        </w:rPr>
+      </w:pPr>
+      <w:r>
+        <w:rPr>
+          <w:rFonts w:ascii="Times New Roman" w:hAnsi="Times New Roman" w:cs="Times New Roman"/>
+          <w:sz w:val="24"/>
+          <w:szCs w:val="24"/>
+        </w:rPr>
+        <w:t xml:space="preserve">21 and "Student" are stored in </w:t>
+      </w:r>
+      <w:proofErr w:type="spellStart"/>
+      <w:r>
+        <w:rPr>
+          <w:rFonts w:ascii="Times New Roman" w:hAnsi="Times New Roman" w:cs="Times New Roman"/>
+          <w:sz w:val="24"/>
+          <w:szCs w:val="24"/>
+        </w:rPr>
+        <w:t>args</w:t>
+      </w:r>
+      <w:proofErr w:type="spellEnd"/>
+      <w:r>
+        <w:rPr>
+          <w:rFonts w:ascii="Times New Roman" w:hAnsi="Times New Roman" w:cs="Times New Roman"/>
+          <w:sz w:val="24"/>
+          <w:szCs w:val="24"/>
+        </w:rPr>
+        <w:t xml:space="preserve"> as a tuple (21, "Student").</w:t>
+      </w:r>
+    </w:p>
+    <w:p>
+      <w:pPr>
+        <w:numPr>
+          <w:ilvl w:val="0"/>
+          <w:numId w:val="3"/>
+        </w:numPr>
+        <w:rPr>
+          <w:rFonts w:ascii="Times New Roman" w:hAnsi="Times New Roman" w:cs="Times New Roman"/>
+          <w:sz w:val="24"/>
+          <w:szCs w:val="24"/>
+        </w:rPr>
+      </w:pPr>
+      <w:r>
+        <w:rPr>
+          <w:rFonts w:ascii="Times New Roman" w:hAnsi="Times New Roman" w:cs="Times New Roman"/>
+          <w:sz w:val="24"/>
+          <w:szCs w:val="24"/>
+        </w:rPr>
+        <w:t xml:space="preserve">country="India" and language="Python" are stored in </w:t>
+      </w:r>
+      <w:proofErr w:type="spellStart"/>
+      <w:r>
+        <w:rPr>
+          <w:rFonts w:ascii="Times New Roman" w:hAnsi="Times New Roman" w:cs="Times New Roman"/>
+          <w:sz w:val="24"/>
+          <w:szCs w:val="24"/>
+        </w:rPr>
+        <w:t>kwargs</w:t>
+      </w:r>
+      <w:proofErr w:type="spellEnd"/>
+      <w:r>
+        <w:rPr>
+          <w:rFonts w:ascii="Times New Roman" w:hAnsi="Times New Roman" w:cs="Times New Roman"/>
+          <w:sz w:val="24"/>
+          <w:szCs w:val="24"/>
+        </w:rPr>
+        <w:t xml:space="preserve"> as a dictionary.</w:t>
+      </w:r>
+    </w:p>
+    <w:p>
+      <w:pPr>
+        <w:rPr>
+          <w:rFonts w:ascii="Times New Roman" w:hAnsi="Times New Roman" w:cs="Times New Roman"/>
+          <w:sz w:val="24"/>
+          <w:szCs w:val="24"/>
+        </w:rPr>
+      </w:pPr>
+      <w:r>
+        <w:rPr>
+          <w:rFonts w:ascii="Times New Roman" w:hAnsi="Times New Roman" w:cs="Times New Roman"/>
+          <w:b/>
+          <w:bCs/>
+          <w:sz w:val="24"/>
+          <w:szCs w:val="24"/>
+        </w:rPr>
+        <w:t>Output:</w:t>
+      </w:r>
+    </w:p>
+    <w:p>
+      <w:pPr>
+        <w:rPr>
+          <w:rFonts w:ascii="Times New Roman" w:hAnsi="Times New Roman" w:cs="Times New Roman"/>
+          <w:sz w:val="24"/>
+          <w:szCs w:val="24"/>
+        </w:rPr>
+      </w:pPr>
+      <w:proofErr w:type="spellStart"/>
+      <w:r>
+        <w:rPr>
+          <w:rFonts w:ascii="Times New Roman" w:hAnsi="Times New Roman" w:cs="Times New Roman"/>
+          <w:sz w:val="24"/>
+          <w:szCs w:val="24"/>
+        </w:rPr>
+        <w:t>pgsql</w:t>
+      </w:r>
+      <w:proofErr w:type="spellEnd"/>
+    </w:p>
+    <w:p>
+      <w:pPr>
+        <w:rPr>
+          <w:rFonts w:ascii="Times New Roman" w:hAnsi="Times New Roman" w:cs="Times New Roman"/>
+          <w:sz w:val="24"/>
+          <w:szCs w:val="24"/>
+        </w:rPr>
+      </w:pPr>
+      <w:proofErr w:type="spellStart"/>
+      <w:r>
+        <w:rPr>
+          <w:rFonts w:ascii="Times New Roman" w:hAnsi="Times New Roman" w:cs="Times New Roman"/>
+          <w:sz w:val="24"/>
+          <w:szCs w:val="24"/>
+        </w:rPr>
+        <w:t>CopyEdit</w:t>
+      </w:r>
+      <w:proofErr w:type="spellEnd"/>
+    </w:p>
+    <w:p>
+      <w:pPr>
+        <w:rPr>
+          <w:rFonts w:ascii="Times New Roman" w:hAnsi="Times New Roman" w:cs="Times New Roman"/>
+          <w:sz w:val="24"/>
+          <w:szCs w:val="24"/>
+        </w:rPr>
+      </w:pPr>
+      <w:r>
+        <w:rPr>
+          <w:rFonts w:ascii="Times New Roman" w:hAnsi="Times New Roman" w:cs="Times New Roman"/>
+          <w:sz w:val="24"/>
+          <w:szCs w:val="24"/>
+        </w:rPr>
+        <w:t>Name: Ali</w:t>
+      </w:r>
+    </w:p>
+    <w:p>
+      <w:pPr>
+        <w:rPr>
+          <w:rFonts w:ascii="Times New Roman" w:hAnsi="Times New Roman" w:cs="Times New Roman"/>
+          <w:sz w:val="24"/>
+          <w:szCs w:val="24"/>
+        </w:rPr>
+      </w:pPr>
+      <w:r>
+        <w:rPr>
+          <w:rFonts w:ascii="Times New Roman" w:hAnsi="Times New Roman" w:cs="Times New Roman"/>
+          <w:sz w:val="24"/>
+          <w:szCs w:val="24"/>
+        </w:rPr>
+        <w:t>Additional Info (Tuple): (21, 'Student')</w:t>
+      </w:r>
+    </w:p>
+    <w:p>
+      <w:pPr>
+        <w:rPr>
+          <w:rFonts w:ascii="Times New Roman" w:hAnsi="Times New Roman" w:cs="Times New Roman"/>
+          <w:sz w:val="24"/>
+          <w:szCs w:val="24"/>
+        </w:rPr>
+      </w:pPr>
+      <w:r>
+        <w:rPr>
+          <w:rFonts w:ascii="Times New Roman" w:hAnsi="Times New Roman" w:cs="Times New Roman"/>
+          <w:sz w:val="24"/>
+          <w:szCs w:val="24"/>
+        </w:rPr>
+        <w:t>Details (Dictionary): {'country': 'India', 'language': 'Python'}</w:t>
+      </w:r>
+    </w:p>
+    <w:p>
+      <w:pPr>
+        <w:rPr>
+          <w:rFonts w:ascii="Times New Roman" w:hAnsi="Times New Roman" w:cs="Times New Roman"/>
+          <w:sz w:val="24"/>
+          <w:szCs w:val="24"/>
+        </w:rPr>
+      </w:pPr>
+      <w:r>
+        <w:rPr>
+          <w:rFonts w:ascii="Times New Roman" w:hAnsi="Times New Roman" w:cs="Times New Roman"/>
+          <w:sz w:val="24"/>
+          <w:szCs w:val="24"/>
+        </w:rPr>
+        <w:pict w14:anchorId="2FC4196D">
+          <v:rect id="_x0000_i1070" style="width:0;height:1.5pt" o:hralign="center" o:hrstd="t" o:hr="t" fillcolor="#a0a0a0" stroked="f"/>
+        </w:pict>
+      </w:r>
+    </w:p>
+    <w:p>
+      <w:pPr>
+        <w:rPr>
+          <w:rFonts w:ascii="Times New Roman" w:hAnsi="Times New Roman" w:cs="Times New Roman"/>
+          <w:b/>
+          <w:bCs/>
+          <w:sz w:val="24"/>
+          <w:szCs w:val="24"/>
+        </w:rPr>
+      </w:pPr>
+      <w:r>
+        <w:rPr>
+          <w:rFonts w:ascii="Times New Roman" w:hAnsi="Times New Roman" w:cs="Times New Roman"/>
+          <w:b/>
+          <w:bCs/>
+          <w:sz w:val="24"/>
+          <w:szCs w:val="24"/>
+        </w:rPr>
+        <w:t>4. Unpacking *</w:t>
+      </w:r>
+      <w:proofErr w:type="spellStart"/>
+      <w:r>
+        <w:rPr>
+          <w:rFonts w:ascii="Times New Roman" w:hAnsi="Times New Roman" w:cs="Times New Roman"/>
+          <w:b/>
+          <w:bCs/>
+          <w:sz w:val="24"/>
+          <w:szCs w:val="24"/>
+        </w:rPr>
+        <w:t>args</w:t>
+      </w:r>
+      <w:proofErr w:type="spellEnd"/>
+      <w:r>
+        <w:rPr>
+          <w:rFonts w:ascii="Times New Roman" w:hAnsi="Times New Roman" w:cs="Times New Roman"/>
+          <w:b/>
+          <w:bCs/>
+          <w:sz w:val="24"/>
+          <w:szCs w:val="24"/>
+        </w:rPr>
+        <w:t xml:space="preserve"> and **</w:t>
+      </w:r>
+      <w:proofErr w:type="spellStart"/>
+      <w:r>
+        <w:rPr>
+          <w:rFonts w:ascii="Times New Roman" w:hAnsi="Times New Roman" w:cs="Times New Roman"/>
+          <w:b/>
+          <w:bCs/>
+          <w:sz w:val="24"/>
+          <w:szCs w:val="24"/>
+        </w:rPr>
+        <w:t>kwargs</w:t>
+      </w:r>
+      <w:proofErr w:type="spellEnd"/>
+    </w:p>
+    <w:p>
+      <w:pPr>
+        <w:rPr>
+          <w:rFonts w:ascii="Times New Roman" w:hAnsi="Times New Roman" w:cs="Times New Roman"/>
+          <w:b/>
+          <w:bCs/>
+          <w:sz w:val="24"/>
+          <w:szCs w:val="24"/>
+        </w:rPr>
+      </w:pPr>
+      <w:r>
+        <w:rPr>
+          <w:rFonts w:ascii="Times New Roman" w:hAnsi="Times New Roman" w:cs="Times New Roman"/>
+          <w:b/>
+          <w:bCs/>
+          <w:sz w:val="24"/>
+          <w:szCs w:val="24"/>
+        </w:rPr>
+        <w:t>Unpacking *</w:t>
+      </w:r>
+      <w:proofErr w:type="spellStart"/>
+      <w:r>
+        <w:rPr>
+          <w:rFonts w:ascii="Times New Roman" w:hAnsi="Times New Roman" w:cs="Times New Roman"/>
+          <w:b/>
+          <w:bCs/>
+          <w:sz w:val="24"/>
+          <w:szCs w:val="24"/>
+        </w:rPr>
+        <w:t>args</w:t>
+      </w:r>
+      <w:proofErr w:type="spellEnd"/>
+      <w:r>
+        <w:rPr>
+          <w:rFonts w:ascii="Times New Roman" w:hAnsi="Times New Roman" w:cs="Times New Roman"/>
+          <w:b/>
+          <w:bCs/>
+          <w:sz w:val="24"/>
+          <w:szCs w:val="24"/>
+        </w:rPr>
+        <w:t xml:space="preserve"> (List to Function)</w:t>
+      </w:r>
+    </w:p>
+    <w:p>
+      <w:pPr>
+        <w:rPr>
+          <w:rFonts w:ascii="Times New Roman" w:hAnsi="Times New Roman" w:cs="Times New Roman"/>
+          <w:sz w:val="24"/>
+          <w:szCs w:val="24"/>
+        </w:rPr>
+      </w:pPr>
+      <w:r>
+        <w:rPr>
+          <w:rFonts w:ascii="Times New Roman" w:hAnsi="Times New Roman" w:cs="Times New Roman"/>
+          <w:sz w:val="24"/>
+          <w:szCs w:val="24"/>
+        </w:rPr>
+        <w:t>python</w:t>
+      </w:r>
+    </w:p>
+    <w:p>
+      <w:pPr>
+        <w:rPr>
+          <w:rFonts w:ascii="Times New Roman" w:hAnsi="Times New Roman" w:cs="Times New Roman"/>
+          <w:sz w:val="24"/>
+          <w:szCs w:val="24"/>
+        </w:rPr>
+      </w:pPr>
+      <w:proofErr w:type="spellStart"/>
+      <w:r>
+        <w:rPr>
+          <w:rFonts w:ascii="Times New Roman" w:hAnsi="Times New Roman" w:cs="Times New Roman"/>
+          <w:sz w:val="24"/>
+          <w:szCs w:val="24"/>
+        </w:rPr>
+        <w:t>CopyEdit</w:t>
+      </w:r>
+      <w:proofErr w:type="spellEnd"/>
+    </w:p>
+    <w:p>
+      <w:pPr>
+        <w:rPr>
+          <w:rFonts w:ascii="Times New Roman" w:hAnsi="Times New Roman" w:cs="Times New Roman"/>
+          <w:sz w:val="24"/>
+          <w:szCs w:val="24"/>
+        </w:rPr>
+      </w:pPr>
+      <w:r>
+        <w:rPr>
+          <w:rFonts w:ascii="Times New Roman" w:hAnsi="Times New Roman" w:cs="Times New Roman"/>
+          <w:sz w:val="24"/>
+          <w:szCs w:val="24"/>
+        </w:rPr>
+        <w:t>def add(a, b, c):</w:t>
+      </w:r>
+    </w:p>
+    <w:p>
+      <w:pPr>
+        <w:rPr>
+          <w:rFonts w:ascii="Times New Roman" w:hAnsi="Times New Roman" w:cs="Times New Roman"/>
+          <w:sz w:val="24"/>
+          <w:szCs w:val="24"/>
+        </w:rPr>
+      </w:pPr>
+      <w:r>
+        <w:rPr>
+          <w:rFonts w:ascii="Times New Roman" w:hAnsi="Times New Roman" w:cs="Times New Roman"/>
+          <w:sz w:val="24"/>
+          <w:szCs w:val="24"/>
+        </w:rPr>
+        <w:t xml:space="preserve">    return a + b + c</w:t>
+      </w:r>
+    </w:p>
+    <w:p>
+      <w:pPr>
+        <w:rPr>
+          <w:rFonts w:ascii="Times New Roman" w:hAnsi="Times New Roman" w:cs="Times New Roman"/>
+          <w:sz w:val="24"/>
+          <w:szCs w:val="24"/>
+        </w:rPr>
+      </w:pPr>
+    </w:p>
+    <w:p>
+      <w:pPr>
+        <w:rPr>
+          <w:rFonts w:ascii="Times New Roman" w:hAnsi="Times New Roman" w:cs="Times New Roman"/>
+          <w:sz w:val="24"/>
+          <w:szCs w:val="24"/>
+        </w:rPr>
+      </w:pPr>
+      <w:r>
+        <w:rPr>
+          <w:rFonts w:ascii="Times New Roman" w:hAnsi="Times New Roman" w:cs="Times New Roman"/>
+          <w:sz w:val="24"/>
+          <w:szCs w:val="24"/>
+        </w:rPr>
+        <w:t>numbers = [1, 2, 3]</w:t>
+      </w:r>
+    </w:p>
+    <w:p>
+      <w:pPr>
+        <w:rPr>
+          <w:rFonts w:ascii="Times New Roman" w:hAnsi="Times New Roman" w:cs="Times New Roman"/>
+          <w:sz w:val="24"/>
+          <w:szCs w:val="24"/>
+        </w:rPr>
+      </w:pPr>
+      <w:r>
+        <w:rPr>
+          <w:rFonts w:ascii="Times New Roman" w:hAnsi="Times New Roman" w:cs="Times New Roman"/>
+          <w:sz w:val="24"/>
+          <w:szCs w:val="24"/>
+        </w:rPr>
+        <w:t>print(add(*numbers))  # Unpacking list into arguments</w:t>
+      </w:r>
+    </w:p>
+    <w:p>
+      <w:pPr>
+        <w:rPr>
+          <w:rFonts w:ascii="Times New Roman" w:hAnsi="Times New Roman" w:cs="Times New Roman"/>
+          <w:sz w:val="24"/>
+          <w:szCs w:val="24"/>
+        </w:rPr>
+      </w:pPr>
+      <w:r>
+        <w:rPr>
+          <w:rFonts w:ascii="Times New Roman" w:hAnsi="Times New Roman" w:cs="Times New Roman"/>
+          <w:b/>
+          <w:bCs/>
+          <w:sz w:val="24"/>
+          <w:szCs w:val="24"/>
+        </w:rPr>
+        <w:t>Output:</w:t>
+      </w:r>
+    </w:p>
+    <w:p>
+      <w:pPr>
+        <w:rPr>
+          <w:rFonts w:ascii="Times New Roman" w:hAnsi="Times New Roman" w:cs="Times New Roman"/>
+          <w:sz w:val="24"/>
+          <w:szCs w:val="24"/>
+        </w:rPr>
+      </w:pPr>
+      <w:proofErr w:type="spellStart"/>
+      <w:r>
+        <w:rPr>
+          <w:rFonts w:ascii="Times New Roman" w:hAnsi="Times New Roman" w:cs="Times New Roman"/>
+          <w:sz w:val="24"/>
+          <w:szCs w:val="24"/>
+        </w:rPr>
+        <w:t>CopyEdit</w:t>
+      </w:r>
+      <w:proofErr w:type="spellEnd"/>
+    </w:p>
+    <w:p>
+      <w:pPr>
+        <w:rPr>
+          <w:rFonts w:ascii="Times New Roman" w:hAnsi="Times New Roman" w:cs="Times New Roman"/>
+          <w:sz w:val="24"/>
+          <w:szCs w:val="24"/>
+        </w:rPr>
+      </w:pPr>
+      <w:r>
+        <w:rPr>
+          <w:rFonts w:ascii="Times New Roman" w:hAnsi="Times New Roman" w:cs="Times New Roman"/>
+          <w:sz w:val="24"/>
+          <w:szCs w:val="24"/>
+        </w:rPr>
+        <w:t>6</w:t>
+      </w:r>
+    </w:p>
+    <w:p>
+      <w:pPr>
+        <w:rPr>
+          <w:rFonts w:ascii="Times New Roman" w:hAnsi="Times New Roman" w:cs="Times New Roman"/>
+          <w:b/>
+          <w:bCs/>
+          <w:sz w:val="24"/>
+          <w:szCs w:val="24"/>
+        </w:rPr>
+      </w:pPr>
+      <w:r>
+        <w:rPr>
+          <w:rFonts w:ascii="Times New Roman" w:hAnsi="Times New Roman" w:cs="Times New Roman"/>
+          <w:b/>
+          <w:bCs/>
+          <w:sz w:val="24"/>
+          <w:szCs w:val="24"/>
+        </w:rPr>
+        <w:t>Unpacking **</w:t>
+      </w:r>
+      <w:proofErr w:type="spellStart"/>
+      <w:r>
+        <w:rPr>
+          <w:rFonts w:ascii="Times New Roman" w:hAnsi="Times New Roman" w:cs="Times New Roman"/>
+          <w:b/>
+          <w:bCs/>
+          <w:sz w:val="24"/>
+          <w:szCs w:val="24"/>
+        </w:rPr>
+        <w:t>kwargs</w:t>
+      </w:r>
+      <w:proofErr w:type="spellEnd"/>
+      <w:r>
+        <w:rPr>
+          <w:rFonts w:ascii="Times New Roman" w:hAnsi="Times New Roman" w:cs="Times New Roman"/>
+          <w:b/>
+          <w:bCs/>
+          <w:sz w:val="24"/>
+          <w:szCs w:val="24"/>
+        </w:rPr>
+        <w:t xml:space="preserve"> (Dictionary to Function)</w:t>
+      </w:r>
+    </w:p>
+    <w:p>
+      <w:pPr>
+        <w:rPr>
+          <w:rFonts w:ascii="Times New Roman" w:hAnsi="Times New Roman" w:cs="Times New Roman"/>
+          <w:sz w:val="24"/>
+          <w:szCs w:val="24"/>
+        </w:rPr>
+      </w:pPr>
+      <w:r>
+        <w:rPr>
+          <w:rFonts w:ascii="Times New Roman" w:hAnsi="Times New Roman" w:cs="Times New Roman"/>
+          <w:sz w:val="24"/>
+          <w:szCs w:val="24"/>
+        </w:rPr>
+        <w:t>python</w:t>
+      </w:r>
+    </w:p>
+    <w:p>
+      <w:pPr>
+        <w:rPr>
+          <w:rFonts w:ascii="Times New Roman" w:hAnsi="Times New Roman" w:cs="Times New Roman"/>
+          <w:sz w:val="24"/>
+          <w:szCs w:val="24"/>
+        </w:rPr>
+      </w:pPr>
+      <w:proofErr w:type="spellStart"/>
+      <w:r>
+        <w:rPr>
+          <w:rFonts w:ascii="Times New Roman" w:hAnsi="Times New Roman" w:cs="Times New Roman"/>
+          <w:sz w:val="24"/>
+          <w:szCs w:val="24"/>
+        </w:rPr>
+        <w:t>CopyEdit</w:t>
+      </w:r>
+      <w:proofErr w:type="spellEnd"/>
+    </w:p>
+    <w:p>
+      <w:pPr>
+        <w:rPr>
+          <w:rFonts w:ascii="Times New Roman" w:hAnsi="Times New Roman" w:cs="Times New Roman"/>
+          <w:sz w:val="24"/>
+          <w:szCs w:val="24"/>
+        </w:rPr>
+      </w:pPr>
+      <w:r>
+        <w:rPr>
+          <w:rFonts w:ascii="Times New Roman" w:hAnsi="Times New Roman" w:cs="Times New Roman"/>
+          <w:sz w:val="24"/>
+          <w:szCs w:val="24"/>
+        </w:rPr>
+        <w:t>def greet(name, age):</w:t>
+      </w:r>
+    </w:p>
+    <w:p>
+      <w:pPr>
+        <w:rPr>
+          <w:rFonts w:ascii="Times New Roman" w:hAnsi="Times New Roman" w:cs="Times New Roman"/>
+          <w:sz w:val="24"/>
+          <w:szCs w:val="24"/>
+        </w:rPr>
+      </w:pPr>
+      <w:r>
+        <w:rPr>
+          <w:rFonts w:ascii="Times New Roman" w:hAnsi="Times New Roman" w:cs="Times New Roman"/>
+          <w:sz w:val="24"/>
+          <w:szCs w:val="24"/>
+        </w:rPr>
+        <w:t xml:space="preserve">    print(</w:t>
+      </w:r>
+      <w:proofErr w:type="spellStart"/>
+      <w:r>
+        <w:rPr>
+          <w:rFonts w:ascii="Times New Roman" w:hAnsi="Times New Roman" w:cs="Times New Roman"/>
+          <w:sz w:val="24"/>
+          <w:szCs w:val="24"/>
+        </w:rPr>
+        <w:t>f"Hello</w:t>
+      </w:r>
+      <w:proofErr w:type="spellEnd"/>
+      <w:r>
+        <w:rPr>
+          <w:rFonts w:ascii="Times New Roman" w:hAnsi="Times New Roman" w:cs="Times New Roman"/>
+          <w:sz w:val="24"/>
+          <w:szCs w:val="24"/>
+        </w:rPr>
+        <w:t>, my name is {name} and I am {age} years old.")</w:t>
+      </w:r>
+    </w:p>
+    <w:p>
+      <w:pPr>
+        <w:rPr>
+          <w:rFonts w:ascii="Times New Roman" w:hAnsi="Times New Roman" w:cs="Times New Roman"/>
+          <w:sz w:val="24"/>
+          <w:szCs w:val="24"/>
+        </w:rPr>
+      </w:pPr>
+    </w:p>
+    <w:p>
+      <w:pPr>
+        <w:rPr>
+          <w:rFonts w:ascii="Times New Roman" w:hAnsi="Times New Roman" w:cs="Times New Roman"/>
+          <w:sz w:val="24"/>
+          <w:szCs w:val="24"/>
+        </w:rPr>
+      </w:pPr>
+      <w:r>
+        <w:rPr>
+          <w:rFonts w:ascii="Times New Roman" w:hAnsi="Times New Roman" w:cs="Times New Roman"/>
+          <w:sz w:val="24"/>
+          <w:szCs w:val="24"/>
+        </w:rPr>
+        <w:t>person = {"name": "Ali", "age": 21}</w:t>
+      </w:r>
+    </w:p>
+    <w:p>
+      <w:pPr>
+        <w:rPr>
+          <w:rFonts w:ascii="Times New Roman" w:hAnsi="Times New Roman" w:cs="Times New Roman"/>
+          <w:sz w:val="24"/>
+          <w:szCs w:val="24"/>
+        </w:rPr>
+      </w:pPr>
+      <w:r>
+        <w:rPr>
+          <w:rFonts w:ascii="Times New Roman" w:hAnsi="Times New Roman" w:cs="Times New Roman"/>
+          <w:sz w:val="24"/>
+          <w:szCs w:val="24"/>
+        </w:rPr>
+        <w:t>greet(**person)  # Unpacking dictionary into arguments</w:t>
+      </w:r>
+    </w:p>
+    <w:p>
+      <w:pPr>
+        <w:rPr>
+          <w:rFonts w:ascii="Times New Roman" w:hAnsi="Times New Roman" w:cs="Times New Roman"/>
+          <w:sz w:val="24"/>
+          <w:szCs w:val="24"/>
+        </w:rPr>
+      </w:pPr>
+      <w:r>
+        <w:rPr>
+          <w:rFonts w:ascii="Times New Roman" w:hAnsi="Times New Roman" w:cs="Times New Roman"/>
+          <w:b/>
+          <w:bCs/>
+          <w:sz w:val="24"/>
+          <w:szCs w:val="24"/>
+        </w:rPr>
+        <w:t>Output:</w:t>
+      </w:r>
+    </w:p>
+    <w:p>
+      <w:pPr>
+        <w:rPr>
+          <w:rFonts w:ascii="Times New Roman" w:hAnsi="Times New Roman" w:cs="Times New Roman"/>
+          <w:sz w:val="24"/>
+          <w:szCs w:val="24"/>
+        </w:rPr>
+      </w:pPr>
+      <w:proofErr w:type="spellStart"/>
+      <w:r>
+        <w:rPr>
+          <w:rFonts w:ascii="Times New Roman" w:hAnsi="Times New Roman" w:cs="Times New Roman"/>
+          <w:sz w:val="24"/>
+          <w:szCs w:val="24"/>
+        </w:rPr>
+        <w:t>pgsql</w:t>
+      </w:r>
+      <w:proofErr w:type="spellEnd"/>
+    </w:p>
+    <w:p>
+      <w:pPr>
+        <w:rPr>
+          <w:rFonts w:ascii="Times New Roman" w:hAnsi="Times New Roman" w:cs="Times New Roman"/>
+          <w:sz w:val="24"/>
+          <w:szCs w:val="24"/>
+        </w:rPr>
+      </w:pPr>
+      <w:proofErr w:type="spellStart"/>
+      <w:r>
+        <w:rPr>
+          <w:rFonts w:ascii="Times New Roman" w:hAnsi="Times New Roman" w:cs="Times New Roman"/>
+          <w:sz w:val="24"/>
+          <w:szCs w:val="24"/>
+        </w:rPr>
+        <w:t>CopyEdit</w:t>
+      </w:r>
+      <w:proofErr w:type="spellEnd"/>
+    </w:p>
+    <w:p>
+      <w:pPr>
+        <w:rPr>
+          <w:rFonts w:ascii="Times New Roman" w:hAnsi="Times New Roman" w:cs="Times New Roman"/>
+          <w:sz w:val="24"/>
+          <w:szCs w:val="24"/>
+        </w:rPr>
+      </w:pPr>
+      <w:r>
+        <w:rPr>
+          <w:rFonts w:ascii="Times New Roman" w:hAnsi="Times New Roman" w:cs="Times New Roman"/>
+          <w:sz w:val="24"/>
+          <w:szCs w:val="24"/>
+        </w:rPr>
+        <w:t>Hello, my name is Ali and I am 21 years old.</w:t>
+      </w:r>
+    </w:p>
+    <w:p>
+      <w:pPr>
+        <w:rPr>
+          <w:rFonts w:ascii="Times New Roman" w:hAnsi="Times New Roman" w:cs="Times New Roman"/>
+          <w:sz w:val="24"/>
+          <w:szCs w:val="24"/>
+        </w:rPr>
+      </w:pPr>
+      <w:r>
+        <w:rPr>
+          <w:rFonts w:ascii="Times New Roman" w:hAnsi="Times New Roman" w:cs="Times New Roman"/>
+          <w:sz w:val="24"/>
+          <w:szCs w:val="24"/>
+        </w:rPr>
+        <w:pict w14:anchorId="11104198">
+          <v:rect id="_x0000_i1071" style="width:0;height:1.5pt" o:hralign="center" o:hrstd="t" o:hr="t" fillcolor="#a0a0a0" stroked="f"/>
+        </w:pict>
+      </w:r>
+    </w:p>
+    <w:p>
+      <w:pPr>
+        <w:rPr>
+          <w:rFonts w:ascii="Times New Roman" w:hAnsi="Times New Roman" w:cs="Times New Roman"/>
+          <w:b/>
+          <w:bCs/>
+          <w:sz w:val="24"/>
+          <w:szCs w:val="24"/>
+        </w:rPr>
+      </w:pPr>
+      <w:r>
+        <w:rPr>
+          <w:rFonts w:ascii="Times New Roman" w:hAnsi="Times New Roman" w:cs="Times New Roman"/>
+          <w:b/>
+          <w:bCs/>
+          <w:sz w:val="24"/>
+          <w:szCs w:val="24"/>
+        </w:rPr>
+        <w:t>5. Key Differences Between *</w:t>
+      </w:r>
+      <w:proofErr w:type="spellStart"/>
+      <w:r>
+        <w:rPr>
+          <w:rFonts w:ascii="Times New Roman" w:hAnsi="Times New Roman" w:cs="Times New Roman"/>
+          <w:b/>
+          <w:bCs/>
+          <w:sz w:val="24"/>
+          <w:szCs w:val="24"/>
+        </w:rPr>
+        <w:t>args</w:t>
+      </w:r>
+      <w:proofErr w:type="spellEnd"/>
+      <w:r>
+        <w:rPr>
+          <w:rFonts w:ascii="Times New Roman" w:hAnsi="Times New Roman" w:cs="Times New Roman"/>
+          <w:b/>
+          <w:bCs/>
+          <w:sz w:val="24"/>
+          <w:szCs w:val="24"/>
+        </w:rPr>
+        <w:t xml:space="preserve"> and **</w:t>
+      </w:r>
+      <w:proofErr w:type="spellStart"/>
+      <w:r>
+        <w:rPr>
+          <w:rFonts w:ascii="Times New Roman" w:hAnsi="Times New Roman" w:cs="Times New Roman"/>
+          <w:b/>
+          <w:bCs/>
+          <w:sz w:val="24"/>
+          <w:szCs w:val="24"/>
+        </w:rPr>
+        <w:t>kwargs</w:t>
+      </w:r>
+      <w:proofErr w:type="spellEnd"/>
+    </w:p>
+    <w:tbl>
+      <w:tblPr>
+        <w:tblW w:w="0" w:type="auto"/>
+        <w:tblCellSpacing w:w="15" w:type="dxa"/>
+        <w:tblCellMar>
+          <w:top w:w="15" w:type="dxa"/>
+          <w:left w:w="15" w:type="dxa"/>
+          <w:bottom w:w="15" w:type="dxa"/>
+          <w:right w:w="15" w:type="dxa"/>
+        </w:tblCellMar>
+        <w:tblLook w:val="04A0" w:firstRow="1" w:lastRow="0" w:firstColumn="1" w:lastColumn="0" w:noHBand="0" w:noVBand="1"/>
+      </w:tblPr>
+      <w:tblGrid>
+        <w:gridCol w:w="1469"/>
+        <w:gridCol w:w="2949"/>
+        <w:gridCol w:w="3584"/>
+      </w:tblGrid>
+      <w:tr>
+        <w:trPr>
+          <w:tblHeader/>
+          <w:tblCellSpacing w:w="15" w:type="dxa"/>
+        </w:trPr>
+        <w:tc>
+          <w:tcPr>
+            <w:tcW w:w="0" w:type="auto"/>
+            <w:vAlign w:val="center"/>
+            <w:hideMark/>
+          </w:tcPr>
+          <w:p>
+            <w:pPr>
+              <w:rPr>
+                <w:rFonts w:ascii="Times New Roman" w:hAnsi="Times New Roman" w:cs="Times New Roman"/>
+                <w:b/>
+                <w:bCs/>
+                <w:sz w:val="24"/>
+                <w:szCs w:val="24"/>
+              </w:rPr>
+            </w:pPr>
+            <w:r>
+              <w:rPr>
+                <w:rFonts w:ascii="Times New Roman" w:hAnsi="Times New Roman" w:cs="Times New Roman"/>
+                <w:b/>
+                <w:bCs/>
+                <w:sz w:val="24"/>
+                <w:szCs w:val="24"/>
+              </w:rPr>
+              <w:t>Feature</w:t>
+            </w:r>
+          </w:p>
+        </w:tc>
+        <w:tc>
+          <w:tcPr>
+            <w:tcW w:w="0" w:type="auto"/>
+            <w:vAlign w:val="center"/>
+            <w:hideMark/>
+          </w:tcPr>
+          <w:p>
+            <w:pPr>
+              <w:rPr>
+                <w:rFonts w:ascii="Times New Roman" w:hAnsi="Times New Roman" w:cs="Times New Roman"/>
+                <w:b/>
+                <w:bCs/>
+                <w:sz w:val="24"/>
+                <w:szCs w:val="24"/>
+              </w:rPr>
+            </w:pPr>
+            <w:r>
+              <w:rPr>
+                <w:rFonts w:ascii="Times New Roman" w:hAnsi="Times New Roman" w:cs="Times New Roman"/>
+                <w:b/>
+                <w:bCs/>
+                <w:sz w:val="24"/>
+                <w:szCs w:val="24"/>
+              </w:rPr>
+              <w:t>*</w:t>
+            </w:r>
+            <w:proofErr w:type="spellStart"/>
+            <w:r>
+              <w:rPr>
+                <w:rFonts w:ascii="Times New Roman" w:hAnsi="Times New Roman" w:cs="Times New Roman"/>
+                <w:b/>
+                <w:bCs/>
+                <w:sz w:val="24"/>
+                <w:szCs w:val="24"/>
+              </w:rPr>
+              <w:t>args</w:t>
+            </w:r>
+            <w:proofErr w:type="spellEnd"/>
+          </w:p>
+        </w:tc>
+        <w:tc>
+          <w:tcPr>
+            <w:tcW w:w="0" w:type="auto"/>
+            <w:vAlign w:val="center"/>
+            <w:hideMark/>
+          </w:tcPr>
+          <w:p>
+            <w:pPr>
+              <w:rPr>
+                <w:rFonts w:ascii="Times New Roman" w:hAnsi="Times New Roman" w:cs="Times New Roman"/>
+                <w:b/>
+                <w:bCs/>
+                <w:sz w:val="24"/>
+                <w:szCs w:val="24"/>
+              </w:rPr>
+            </w:pPr>
+            <w:r>
+              <w:rPr>
+                <w:rFonts w:ascii="Times New Roman" w:hAnsi="Times New Roman" w:cs="Times New Roman"/>
+                <w:b/>
+                <w:bCs/>
+                <w:sz w:val="24"/>
+                <w:szCs w:val="24"/>
+              </w:rPr>
+              <w:t>**</w:t>
+            </w:r>
+            <w:proofErr w:type="spellStart"/>
+            <w:r>
+              <w:rPr>
+                <w:rFonts w:ascii="Times New Roman" w:hAnsi="Times New Roman" w:cs="Times New Roman"/>
+                <w:b/>
+                <w:bCs/>
+                <w:sz w:val="24"/>
+                <w:szCs w:val="24"/>
+              </w:rPr>
+              <w:t>kwargs</w:t>
+            </w:r>
+            <w:proofErr w:type="spellEnd"/>
+          </w:p>
+        </w:tc>
+      </w:tr>
+      <w:tr>
+        <w:trPr>
+          <w:tblCellSpacing w:w="15" w:type="dxa"/>
+        </w:trPr>
+        <w:tc>
+          <w:tcPr>
+            <w:tcW w:w="0" w:type="auto"/>
+            <w:vAlign w:val="center"/>
+            <w:hideMark/>
+          </w:tcPr>
+          <w:p>
+            <w:pPr>
+              <w:rPr>
+                <w:rFonts w:ascii="Times New Roman" w:hAnsi="Times New Roman" w:cs="Times New Roman"/>
+                <w:sz w:val="24"/>
+                <w:szCs w:val="24"/>
+              </w:rPr>
+            </w:pPr>
+            <w:r>
+              <w:rPr>
+                <w:rFonts w:ascii="Times New Roman" w:hAnsi="Times New Roman" w:cs="Times New Roman"/>
+                <w:b/>
+                <w:bCs/>
+                <w:sz w:val="24"/>
+                <w:szCs w:val="24"/>
+              </w:rPr>
+              <w:t>Use</w:t>
+            </w:r>
+          </w:p>
+        </w:tc>
+        <w:tc>
+          <w:tcPr>
+            <w:tcW w:w="0" w:type="auto"/>
+            <w:vAlign w:val="center"/>
+            <w:hideMark/>
+          </w:tcPr>
+          <w:p>
+            <w:pPr>
+              <w:rPr>
+                <w:rFonts w:ascii="Times New Roman" w:hAnsi="Times New Roman" w:cs="Times New Roman"/>
+                <w:sz w:val="24"/>
+                <w:szCs w:val="24"/>
+              </w:rPr>
+            </w:pPr>
+            <w:r>
+              <w:rPr>
+                <w:rFonts w:ascii="Times New Roman" w:hAnsi="Times New Roman" w:cs="Times New Roman"/>
+                <w:sz w:val="24"/>
+                <w:szCs w:val="24"/>
+              </w:rPr>
+              <w:t>Multiple positional arguments</w:t>
+            </w:r>
+          </w:p>
+        </w:tc>
+        <w:tc>
+          <w:tcPr>
+            <w:tcW w:w="0" w:type="auto"/>
+            <w:vAlign w:val="center"/>
+            <w:hideMark/>
+          </w:tcPr>
+          <w:p>
+            <w:pPr>
+              <w:rPr>
+                <w:rFonts w:ascii="Times New Roman" w:hAnsi="Times New Roman" w:cs="Times New Roman"/>
+                <w:sz w:val="24"/>
+                <w:szCs w:val="24"/>
+              </w:rPr>
+            </w:pPr>
+            <w:r>
+              <w:rPr>
+                <w:rFonts w:ascii="Times New Roman" w:hAnsi="Times New Roman" w:cs="Times New Roman"/>
+                <w:sz w:val="24"/>
+                <w:szCs w:val="24"/>
+              </w:rPr>
+              <w:t>Multiple keyword arguments</w:t>
+            </w:r>
+          </w:p>
+        </w:tc>
+      </w:tr>
+      <w:tr>
+        <w:trPr>
+          <w:tblCellSpacing w:w="15" w:type="dxa"/>
+        </w:trPr>
+        <w:tc>
+          <w:tcPr>
+            <w:tcW w:w="0" w:type="auto"/>
+            <w:vAlign w:val="center"/>
+            <w:hideMark/>
+          </w:tcPr>
+          <w:p>
+            <w:pPr>
+              <w:rPr>
+                <w:rFonts w:ascii="Times New Roman" w:hAnsi="Times New Roman" w:cs="Times New Roman"/>
+                <w:sz w:val="24"/>
+                <w:szCs w:val="24"/>
+              </w:rPr>
+            </w:pPr>
+            <w:r>
+              <w:rPr>
+                <w:rFonts w:ascii="Times New Roman" w:hAnsi="Times New Roman" w:cs="Times New Roman"/>
+                <w:b/>
+                <w:bCs/>
+                <w:sz w:val="24"/>
+                <w:szCs w:val="24"/>
+              </w:rPr>
+              <w:t>Stored As</w:t>
+            </w:r>
+          </w:p>
+        </w:tc>
+        <w:tc>
+          <w:tcPr>
+            <w:tcW w:w="0" w:type="auto"/>
+            <w:vAlign w:val="center"/>
+            <w:hideMark/>
+          </w:tcPr>
+          <w:p>
+            <w:pPr>
+              <w:rPr>
+                <w:rFonts w:ascii="Times New Roman" w:hAnsi="Times New Roman" w:cs="Times New Roman"/>
+                <w:sz w:val="24"/>
+                <w:szCs w:val="24"/>
+              </w:rPr>
+            </w:pPr>
+            <w:r>
+              <w:rPr>
+                <w:rFonts w:ascii="Times New Roman" w:hAnsi="Times New Roman" w:cs="Times New Roman"/>
+                <w:sz w:val="24"/>
+                <w:szCs w:val="24"/>
+              </w:rPr>
+              <w:t>Tuple ((1, 2, 3))</w:t>
+            </w:r>
+          </w:p>
+        </w:tc>
+        <w:tc>
+          <w:tcPr>
+            <w:tcW w:w="0" w:type="auto"/>
+            <w:vAlign w:val="center"/>
+            <w:hideMark/>
+          </w:tcPr>
+          <w:p>
+            <w:pPr>
+              <w:rPr>
+                <w:rFonts w:ascii="Times New Roman" w:hAnsi="Times New Roman" w:cs="Times New Roman"/>
+                <w:sz w:val="24"/>
+                <w:szCs w:val="24"/>
+              </w:rPr>
+            </w:pPr>
+            <w:r>
+              <w:rPr>
+                <w:rFonts w:ascii="Times New Roman" w:hAnsi="Times New Roman" w:cs="Times New Roman"/>
+                <w:sz w:val="24"/>
+                <w:szCs w:val="24"/>
+              </w:rPr>
+              <w:t>Dictionary ({'name': 'Ali', 'age': 21})</w:t>
+            </w:r>
+          </w:p>
+        </w:tc>
+      </w:tr>
+      <w:tr>
+        <w:trPr>
+          <w:tblCellSpacing w:w="15" w:type="dxa"/>
+        </w:trPr>
+        <w:tc>
+          <w:tcPr>
+            <w:tcW w:w="0" w:type="auto"/>
+            <w:vAlign w:val="center"/>
+            <w:hideMark/>
+          </w:tcPr>
+          <w:p>
+            <w:pPr>
+              <w:rPr>
+                <w:rFonts w:ascii="Times New Roman" w:hAnsi="Times New Roman" w:cs="Times New Roman"/>
+                <w:sz w:val="24"/>
+                <w:szCs w:val="24"/>
+              </w:rPr>
+            </w:pPr>
+            <w:r>
+              <w:rPr>
+                <w:rFonts w:ascii="Times New Roman" w:hAnsi="Times New Roman" w:cs="Times New Roman"/>
+                <w:b/>
+                <w:bCs/>
+                <w:sz w:val="24"/>
+                <w:szCs w:val="24"/>
+              </w:rPr>
+              <w:t>Example Call</w:t>
+            </w:r>
+          </w:p>
+        </w:tc>
+        <w:tc>
+          <w:tcPr>
+            <w:tcW w:w="0" w:type="auto"/>
+            <w:vAlign w:val="center"/>
+            <w:hideMark/>
+          </w:tcPr>
+          <w:p>
+            <w:pPr>
+              <w:rPr>
+                <w:rFonts w:ascii="Times New Roman" w:hAnsi="Times New Roman" w:cs="Times New Roman"/>
+                <w:sz w:val="24"/>
+                <w:szCs w:val="24"/>
+              </w:rPr>
+            </w:pPr>
+            <w:proofErr w:type="spellStart"/>
+            <w:r>
+              <w:rPr>
+                <w:rFonts w:ascii="Times New Roman" w:hAnsi="Times New Roman" w:cs="Times New Roman"/>
+                <w:sz w:val="24"/>
+                <w:szCs w:val="24"/>
+              </w:rPr>
+              <w:t>func</w:t>
+            </w:r>
+            <w:proofErr w:type="spellEnd"/>
+            <w:r>
+              <w:rPr>
+                <w:rFonts w:ascii="Times New Roman" w:hAnsi="Times New Roman" w:cs="Times New Roman"/>
+                <w:sz w:val="24"/>
+                <w:szCs w:val="24"/>
+              </w:rPr>
+              <w:t>(1, 2, 3)</w:t>
+            </w:r>
+          </w:p>
+        </w:tc>
+        <w:tc>
+          <w:tcPr>
+            <w:tcW w:w="0" w:type="auto"/>
+            <w:vAlign w:val="center"/>
+            <w:hideMark/>
+          </w:tcPr>
+          <w:p>
+            <w:pPr>
+              <w:rPr>
+                <w:rFonts w:ascii="Times New Roman" w:hAnsi="Times New Roman" w:cs="Times New Roman"/>
+                <w:sz w:val="24"/>
+                <w:szCs w:val="24"/>
+              </w:rPr>
+            </w:pPr>
+            <w:proofErr w:type="spellStart"/>
+            <w:r>
+              <w:rPr>
+                <w:rFonts w:ascii="Times New Roman" w:hAnsi="Times New Roman" w:cs="Times New Roman"/>
+                <w:sz w:val="24"/>
+                <w:szCs w:val="24"/>
+              </w:rPr>
+              <w:t>func</w:t>
+            </w:r>
+            <w:proofErr w:type="spellEnd"/>
+            <w:r>
+              <w:rPr>
+                <w:rFonts w:ascii="Times New Roman" w:hAnsi="Times New Roman" w:cs="Times New Roman"/>
+                <w:sz w:val="24"/>
+                <w:szCs w:val="24"/>
+              </w:rPr>
+              <w:t>(name="Ali", age=21)</w:t>
+            </w:r>
+          </w:p>
+        </w:tc>
+      </w:tr>
+    </w:tbl>
+    <w:p>
+      <w:pPr>
+        <w:rPr>
+          <w:rFonts w:ascii="Times New Roman" w:hAnsi="Times New Roman" w:cs="Times New Roman"/>
+          <w:sz w:val="24"/>
+          <w:szCs w:val="24"/>
+        </w:rPr>
+      </w:pPr>
+      <w:r>
+        <w:rPr>
+          <w:rFonts w:ascii="Times New Roman" w:hAnsi="Times New Roman" w:cs="Times New Roman"/>
+          <w:sz w:val="24"/>
+          <w:szCs w:val="24"/>
+        </w:rPr>
+        <w:pict w14:anchorId="37B11346">
+          <v:rect id="_x0000_i1072" style="width:0;height:1.5pt" o:hralign="center" o:hrstd="t" o:hr="t" fillcolor="#a0a0a0" stroked="f"/>
+        </w:pict>
+      </w:r>
+    </w:p>
+    <w:p>
+      <w:pPr>
+        <w:rPr>
+          <w:rFonts w:ascii="Times New Roman" w:hAnsi="Times New Roman" w:cs="Times New Roman"/>
+          <w:b/>
+          <w:bCs/>
+          <w:sz w:val="24"/>
+          <w:szCs w:val="24"/>
+        </w:rPr>
+      </w:pPr>
+      <w:r>
+        <w:rPr>
+          <w:rFonts w:ascii="Times New Roman" w:hAnsi="Times New Roman" w:cs="Times New Roman"/>
+          <w:b/>
+          <w:bCs/>
+          <w:sz w:val="24"/>
+          <w:szCs w:val="24"/>
+        </w:rPr>
+        <w:t>6. Best Practices</w:t>
+      </w:r>
+    </w:p>
+    <w:p>
+      <w:pPr>
+        <w:numPr>
+          <w:ilvl w:val="0"/>
+          <w:numId w:val="4"/>
+        </w:numPr>
+        <w:rPr>
+          <w:rFonts w:ascii="Times New Roman" w:hAnsi="Times New Roman" w:cs="Times New Roman"/>
+          <w:sz w:val="24"/>
+          <w:szCs w:val="24"/>
+        </w:rPr>
+      </w:pPr>
+      <w:r>
+        <w:rPr>
+          <w:rFonts w:ascii="Times New Roman" w:hAnsi="Times New Roman" w:cs="Times New Roman"/>
+          <w:sz w:val="24"/>
+          <w:szCs w:val="24"/>
+        </w:rPr>
+        <w:t>Use *</w:t>
+      </w:r>
+      <w:proofErr w:type="spellStart"/>
+      <w:r>
+        <w:rPr>
+          <w:rFonts w:ascii="Times New Roman" w:hAnsi="Times New Roman" w:cs="Times New Roman"/>
+          <w:sz w:val="24"/>
+          <w:szCs w:val="24"/>
+        </w:rPr>
+        <w:t>args</w:t>
+      </w:r>
+      <w:proofErr w:type="spellEnd"/>
+      <w:r>
+        <w:rPr>
+          <w:rFonts w:ascii="Times New Roman" w:hAnsi="Times New Roman" w:cs="Times New Roman"/>
+          <w:sz w:val="24"/>
+          <w:szCs w:val="24"/>
+        </w:rPr>
+        <w:t xml:space="preserve"> when you </w:t>
+      </w:r>
+      <w:r>
+        <w:rPr>
+          <w:rFonts w:ascii="Times New Roman" w:hAnsi="Times New Roman" w:cs="Times New Roman"/>
+          <w:b/>
+          <w:bCs/>
+          <w:sz w:val="24"/>
+          <w:szCs w:val="24"/>
+        </w:rPr>
+        <w:t>don’t know how many positional arguments</w:t>
+      </w:r>
+      <w:r>
+        <w:rPr>
+          <w:rFonts w:ascii="Times New Roman" w:hAnsi="Times New Roman" w:cs="Times New Roman"/>
+          <w:sz w:val="24"/>
+          <w:szCs w:val="24"/>
+        </w:rPr>
+        <w:t xml:space="preserve"> will be passed.</w:t>
+      </w:r>
+    </w:p>
+    <w:p>
+      <w:pPr>
+        <w:numPr>
+          <w:ilvl w:val="0"/>
+          <w:numId w:val="4"/>
+        </w:numPr>
+        <w:rPr>
+          <w:rFonts w:ascii="Times New Roman" w:hAnsi="Times New Roman" w:cs="Times New Roman"/>
+          <w:sz w:val="24"/>
+          <w:szCs w:val="24"/>
+        </w:rPr>
+      </w:pPr>
+      <w:r>
+        <w:rPr>
+          <w:rFonts w:ascii="Times New Roman" w:hAnsi="Times New Roman" w:cs="Times New Roman"/>
+          <w:sz w:val="24"/>
+          <w:szCs w:val="24"/>
+        </w:rPr>
+        <w:t>Use **</w:t>
+      </w:r>
+      <w:proofErr w:type="spellStart"/>
+      <w:r>
+        <w:rPr>
+          <w:rFonts w:ascii="Times New Roman" w:hAnsi="Times New Roman" w:cs="Times New Roman"/>
+          <w:sz w:val="24"/>
+          <w:szCs w:val="24"/>
+        </w:rPr>
+        <w:t>kwargs</w:t>
+      </w:r>
+      <w:proofErr w:type="spellEnd"/>
+      <w:r>
+        <w:rPr>
+          <w:rFonts w:ascii="Times New Roman" w:hAnsi="Times New Roman" w:cs="Times New Roman"/>
+          <w:sz w:val="24"/>
+          <w:szCs w:val="24"/>
+        </w:rPr>
+        <w:t xml:space="preserve"> when you </w:t>
+      </w:r>
+      <w:r>
+        <w:rPr>
+          <w:rFonts w:ascii="Times New Roman" w:hAnsi="Times New Roman" w:cs="Times New Roman"/>
+          <w:b/>
+          <w:bCs/>
+          <w:sz w:val="24"/>
+          <w:szCs w:val="24"/>
+        </w:rPr>
+        <w:t>don’t know how many named arguments</w:t>
+      </w:r>
+      <w:r>
+        <w:rPr>
+          <w:rFonts w:ascii="Times New Roman" w:hAnsi="Times New Roman" w:cs="Times New Roman"/>
+          <w:sz w:val="24"/>
+          <w:szCs w:val="24"/>
+        </w:rPr>
+        <w:t xml:space="preserve"> will be passed.</w:t>
+      </w:r>
+    </w:p>
+    <w:p>
+      <w:pPr>
+        <w:numPr>
+          <w:ilvl w:val="0"/>
+          <w:numId w:val="4"/>
+        </w:numPr>
+        <w:rPr>
+          <w:rFonts w:ascii="Times New Roman" w:hAnsi="Times New Roman" w:cs="Times New Roman"/>
+          <w:sz w:val="24"/>
+          <w:szCs w:val="24"/>
+        </w:rPr>
+      </w:pPr>
+      <w:r>
+        <w:rPr>
+          <w:rFonts w:ascii="Times New Roman" w:hAnsi="Times New Roman" w:cs="Times New Roman"/>
+          <w:sz w:val="24"/>
+          <w:szCs w:val="24"/>
+        </w:rPr>
+        <w:t>Always put *</w:t>
+      </w:r>
+      <w:proofErr w:type="spellStart"/>
+      <w:r>
+        <w:rPr>
+          <w:rFonts w:ascii="Times New Roman" w:hAnsi="Times New Roman" w:cs="Times New Roman"/>
+          <w:sz w:val="24"/>
+          <w:szCs w:val="24"/>
+        </w:rPr>
+        <w:t>args</w:t>
+      </w:r>
+      <w:proofErr w:type="spellEnd"/>
+      <w:r>
+        <w:rPr>
+          <w:rFonts w:ascii="Times New Roman" w:hAnsi="Times New Roman" w:cs="Times New Roman"/>
+          <w:sz w:val="24"/>
+          <w:szCs w:val="24"/>
+        </w:rPr>
+        <w:t xml:space="preserve"> before **</w:t>
+      </w:r>
+      <w:proofErr w:type="spellStart"/>
+      <w:r>
+        <w:rPr>
+          <w:rFonts w:ascii="Times New Roman" w:hAnsi="Times New Roman" w:cs="Times New Roman"/>
+          <w:sz w:val="24"/>
+          <w:szCs w:val="24"/>
+        </w:rPr>
+        <w:t>kwargs</w:t>
+      </w:r>
+      <w:proofErr w:type="spellEnd"/>
+      <w:r>
+        <w:rPr>
+          <w:rFonts w:ascii="Times New Roman" w:hAnsi="Times New Roman" w:cs="Times New Roman"/>
+          <w:sz w:val="24"/>
+          <w:szCs w:val="24"/>
+        </w:rPr>
+        <w:t xml:space="preserve"> in function definitions.</w:t>
+      </w:r>
+    </w:p>
+    <w:p>
+      <w:pPr>
+        <w:rPr>
+          <w:rFonts w:ascii="Times New Roman" w:hAnsi="Times New Roman" w:cs="Times New Roman"/>
+          <w:sz w:val="24"/>
+          <w:szCs w:val="24"/>
+        </w:rPr>
+      </w:pPr>
+      <w:r>
+        <w:rPr>
+          <w:rFonts w:ascii="Times New Roman" w:hAnsi="Times New Roman" w:cs="Times New Roman"/>
+          <w:sz w:val="24"/>
+          <w:szCs w:val="24"/>
+        </w:rPr>
+        <w:pict w14:anchorId="1F3D40F8">
+          <v:rect id="_x0000_i1073" style="width:0;height:1.5pt" o:hralign="center" o:hrstd="t" o:hr="t" fillcolor="#a0a0a0" stroked="f"/>
+        </w:pict>
+      </w:r>
+    </w:p>
+    <w:p>
+      <w:pPr>
+        <w:rPr>
+          <w:rFonts w:ascii="Times New Roman" w:hAnsi="Times New Roman" w:cs="Times New Roman"/>
+          <w:b/>
+          <w:bCs/>
+          <w:sz w:val="24"/>
+          <w:szCs w:val="24"/>
+        </w:rPr>
+      </w:pPr>
+      <w:r>
+        <w:rPr>
+          <w:rFonts w:ascii="Times New Roman" w:hAnsi="Times New Roman" w:cs="Times New Roman"/>
+          <w:b/>
+          <w:bCs/>
+          <w:sz w:val="24"/>
+          <w:szCs w:val="24"/>
+        </w:rPr>
+        <w:t>Summary</w:t>
+      </w:r>
+    </w:p>
+    <w:p>
+      <w:pPr>
+        <w:rPr>
+          <w:rFonts w:ascii="Times New Roman" w:hAnsi="Times New Roman" w:cs="Times New Roman"/>
+          <w:sz w:val="24"/>
+          <w:szCs w:val="24"/>
+        </w:rPr>
+      </w:pPr>
+      <w:r>
+        <w:rPr>
+          <w:rFonts w:ascii="Segoe UI Emoji" w:hAnsi="Segoe UI Emoji" w:cs="Segoe UI Emoji"/>
+          <w:sz w:val="24"/>
+          <w:szCs w:val="24"/>
+        </w:rPr>
+        <w:t>✅</w:t>
+      </w:r>
+      <w:r>
+        <w:rPr>
+          <w:rFonts w:ascii="Times New Roman" w:hAnsi="Times New Roman" w:cs="Times New Roman"/>
+          <w:sz w:val="24"/>
+          <w:szCs w:val="24"/>
+        </w:rPr>
+        <w:t xml:space="preserve"> *</w:t>
+      </w:r>
+      <w:proofErr w:type="spellStart"/>
+      <w:r>
+        <w:rPr>
+          <w:rFonts w:ascii="Times New Roman" w:hAnsi="Times New Roman" w:cs="Times New Roman"/>
+          <w:sz w:val="24"/>
+          <w:szCs w:val="24"/>
+        </w:rPr>
+        <w:t>args</w:t>
+      </w:r>
+      <w:proofErr w:type="spellEnd"/>
+      <w:r>
+        <w:rPr>
+          <w:rFonts w:ascii="Times New Roman" w:hAnsi="Times New Roman" w:cs="Times New Roman"/>
+          <w:sz w:val="24"/>
+          <w:szCs w:val="24"/>
+        </w:rPr>
+        <w:t xml:space="preserve"> collects </w:t>
+      </w:r>
+      <w:r>
+        <w:rPr>
+          <w:rFonts w:ascii="Times New Roman" w:hAnsi="Times New Roman" w:cs="Times New Roman"/>
+          <w:b/>
+          <w:bCs/>
+          <w:sz w:val="24"/>
+          <w:szCs w:val="24"/>
+        </w:rPr>
+        <w:t>positional arguments</w:t>
+      </w:r>
+      <w:r>
+        <w:rPr>
+          <w:rFonts w:ascii="Times New Roman" w:hAnsi="Times New Roman" w:cs="Times New Roman"/>
+          <w:sz w:val="24"/>
+          <w:szCs w:val="24"/>
+        </w:rPr>
+        <w:t xml:space="preserve"> into a tuple.</w:t>
+      </w:r>
+      <w:r>
+        <w:rPr>
+          <w:rFonts w:ascii="Times New Roman" w:hAnsi="Times New Roman" w:cs="Times New Roman"/>
+          <w:sz w:val="24"/>
+          <w:szCs w:val="24"/>
+        </w:rPr>
+        <w:br/>
+      </w:r>
+      <w:r>
+        <w:rPr>
+          <w:rFonts w:ascii="Segoe UI Emoji" w:hAnsi="Segoe UI Emoji" w:cs="Segoe UI Emoji"/>
+          <w:sz w:val="24"/>
+          <w:szCs w:val="24"/>
+        </w:rPr>
+        <w:t>✅</w:t>
+      </w:r>
+      <w:r>
+        <w:rPr>
+          <w:rFonts w:ascii="Times New Roman" w:hAnsi="Times New Roman" w:cs="Times New Roman"/>
+          <w:sz w:val="24"/>
+          <w:szCs w:val="24"/>
+        </w:rPr>
+        <w:t xml:space="preserve"> **</w:t>
+      </w:r>
+      <w:proofErr w:type="spellStart"/>
+      <w:r>
+        <w:rPr>
+          <w:rFonts w:ascii="Times New Roman" w:hAnsi="Times New Roman" w:cs="Times New Roman"/>
+          <w:sz w:val="24"/>
+          <w:szCs w:val="24"/>
+        </w:rPr>
+        <w:t>kwargs</w:t>
+      </w:r>
+      <w:proofErr w:type="spellEnd"/>
+      <w:r>
+        <w:rPr>
+          <w:rFonts w:ascii="Times New Roman" w:hAnsi="Times New Roman" w:cs="Times New Roman"/>
+          <w:sz w:val="24"/>
+          <w:szCs w:val="24"/>
+        </w:rPr>
+        <w:t xml:space="preserve"> collects </w:t>
+      </w:r>
+      <w:r>
+        <w:rPr>
+          <w:rFonts w:ascii="Times New Roman" w:hAnsi="Times New Roman" w:cs="Times New Roman"/>
+          <w:b/>
+          <w:bCs/>
+          <w:sz w:val="24"/>
+          <w:szCs w:val="24"/>
+        </w:rPr>
+        <w:t>keyword arguments</w:t>
+      </w:r>
+      <w:r>
+        <w:rPr>
+          <w:rFonts w:ascii="Times New Roman" w:hAnsi="Times New Roman" w:cs="Times New Roman"/>
+          <w:sz w:val="24"/>
+          <w:szCs w:val="24"/>
+        </w:rPr>
+        <w:t xml:space="preserve"> into a dictionary.</w:t>
+      </w:r>
+      <w:r>
+        <w:rPr>
+          <w:rFonts w:ascii="Times New Roman" w:hAnsi="Times New Roman" w:cs="Times New Roman"/>
+          <w:sz w:val="24"/>
+          <w:szCs w:val="24"/>
+        </w:rPr>
+        <w:br/>
+      </w:r>
+      <w:r>
+        <w:rPr>
+          <w:rFonts w:ascii="Segoe UI Emoji" w:hAnsi="Segoe UI Emoji" w:cs="Segoe UI Emoji"/>
+          <w:sz w:val="24"/>
+          <w:szCs w:val="24"/>
+        </w:rPr>
+        <w:t>✅</w:t>
+      </w:r>
+      <w:r>
+        <w:rPr>
+          <w:rFonts w:ascii="Times New Roman" w:hAnsi="Times New Roman" w:cs="Times New Roman"/>
+          <w:sz w:val="24"/>
+          <w:szCs w:val="24"/>
+        </w:rPr>
+        <w:t xml:space="preserve"> They allow functions to handle </w:t>
+      </w:r>
+      <w:r>
+        <w:rPr>
+          <w:rFonts w:ascii="Times New Roman" w:hAnsi="Times New Roman" w:cs="Times New Roman"/>
+          <w:b/>
+          <w:bCs/>
+          <w:sz w:val="24"/>
+          <w:szCs w:val="24"/>
+        </w:rPr>
+        <w:t>a dynamic number of arguments</w:t>
+      </w:r>
+      <w:r>
+        <w:rPr>
+          <w:rFonts w:ascii="Times New Roman" w:hAnsi="Times New Roman" w:cs="Times New Roman"/>
+          <w:sz w:val="24"/>
+          <w:szCs w:val="24"/>
+        </w:rPr>
+        <w:t>.</w:t>
+      </w:r>
+      <w:r>
+        <w:rPr>
+          <w:rFonts w:ascii="Times New Roman" w:hAnsi="Times New Roman" w:cs="Times New Roman"/>
+          <w:sz w:val="24"/>
+          <w:szCs w:val="24"/>
+        </w:rPr>
+        <w:br/>
+      </w:r>
+      <w:r>
+        <w:rPr>
+          <w:rFonts w:ascii="Segoe UI Emoji" w:hAnsi="Segoe UI Emoji" w:cs="Segoe UI Emoji"/>
+          <w:sz w:val="24"/>
+          <w:szCs w:val="24"/>
+        </w:rPr>
+        <w:t>✅</w:t>
+      </w:r>
+      <w:r>
+        <w:rPr>
+          <w:rFonts w:ascii="Times New Roman" w:hAnsi="Times New Roman" w:cs="Times New Roman"/>
+          <w:sz w:val="24"/>
+          <w:szCs w:val="24"/>
+        </w:rPr>
+        <w:t xml:space="preserve"> We can </w:t>
+      </w:r>
+      <w:r>
+        <w:rPr>
+          <w:rFonts w:ascii="Times New Roman" w:hAnsi="Times New Roman" w:cs="Times New Roman"/>
+          <w:b/>
+          <w:bCs/>
+          <w:sz w:val="24"/>
+          <w:szCs w:val="24"/>
+        </w:rPr>
+        <w:t>unpack lists and dictionaries</w:t>
+      </w:r>
+      <w:r>
+        <w:rPr>
+          <w:rFonts w:ascii="Times New Roman" w:hAnsi="Times New Roman" w:cs="Times New Roman"/>
+          <w:sz w:val="24"/>
+          <w:szCs w:val="24"/>
+        </w:rPr>
+        <w:t xml:space="preserve"> into function arguments using * and **.</w:t>
+      </w:r>
+    </w:p>
+    <w:p>
+      <w:pPr>
+        <w:rPr>
+          <w:rFonts w:ascii="Times New Roman" w:hAnsi="Times New Roman" w:cs="Times New Roman"/>
+          <w:sz w:val="24"/>
+          <w:szCs w:val="24"/>
+        </w:rPr>
+      </w:pPr>
+    </w:p>
     <w:sectPr>
       <w:pgSz w:w="11906" w:h="16838"/>
       <w:pgMar w:top="425" w:right="567" w:bottom="425" w:left="709" w:header="708" w:footer="708" w:gutter="0"/>
@@ -49,6 +3666,619 @@
     </w:sectPr>
   </w:body>
 </w:document>
+</file>
+
+<file path=word/numbering.xml><?xml version="1.0" encoding="utf-8"?>
+<w:numbering xmlns:wpc="http://schemas.microsoft.com/office/word/2010/wordprocessingCanvas" xmlns:cx="http://schemas.microsoft.com/office/drawing/2014/chartex" xmlns:cx1="http://schemas.microsoft.com/office/drawing/2015/9/8/chartex" xmlns:cx2="http://schemas.microsoft.com/office/drawing/2015/10/21/chartex" xmlns:cx3="http://schemas.microsoft.com/office/drawing/2016/5/9/chartex" xmlns:cx4="http://schemas.microsoft.com/office/drawing/2016/5/10/chartex" xmlns:cx5="http://schemas.microsoft.com/office/drawing/2016/5/11/chartex" xmlns:cx6="http://schemas.microsoft.com/office/drawing/2016/5/12/chartex" xmlns:cx7="http://schemas.microsoft.com/office/drawing/2016/5/13/chartex" xmlns:cx8="http://schemas.microsoft.com/office/drawing/2016/5/14/chartex" xmlns:mc="http://schemas.openxmlformats.org/markup-compatibility/2006" xmlns:aink="http://schemas.microsoft.com/office/drawing/2016/ink" xmlns:am3d="http://schemas.microsoft.com/office/drawing/2017/model3d" xmlns:o="urn:schemas-microsoft-com:office:office" xmlns:oel="http://schemas.microsoft.com/office/2019/extlst" xmlns:r="http://schemas.openxmlformats.org/officeDocument/2006/relationships" xmlns:m="http://schemas.openxmlformats.org/officeDocument/2006/math" xmlns:v="urn:schemas-microsoft-com:vml" xmlns:wp14="http://schemas.microsoft.com/office/word/2010/wordprocessingDrawing" xmlns:wp="http://schemas.openxmlformats.org/drawingml/2006/wordprocessingDrawing" xmlns:w10="urn:schemas-microsoft-com:office:word" xmlns:w="http://schemas.openxmlformats.org/wordprocessingml/2006/main" xmlns:w14="http://schemas.microsoft.com/office/word/2010/wordml" xmlns:w15="http://schemas.microsoft.com/office/word/2012/wordml" xmlns:w16cex="http://schemas.microsoft.com/office/word/2018/wordml/cex" xmlns:w16cid="http://schemas.microsoft.com/office/word/2016/wordml/cid" xmlns:w16="http://schemas.microsoft.com/office/word/2018/wordml" xmlns:w16du="http://schemas.microsoft.com/office/word/2023/wordml/word16du" xmlns:w16sdtdh="http://schemas.microsoft.com/office/word/2020/wordml/sdtdatahash" xmlns:w16sdtfl="http://schemas.microsoft.com/office/word/2024/wordml/sdtformatlock" xmlns:w16se="http://schemas.microsoft.com/office/word/2015/wordml/symex" xmlns:wpg="http://schemas.microsoft.com/office/word/2010/wordprocessingGroup" xmlns:wpi="http://schemas.microsoft.com/office/word/2010/wordprocessingInk" xmlns:wne="http://schemas.microsoft.com/office/word/2006/wordml" xmlns:wps="http://schemas.microsoft.com/office/word/2010/wordprocessingShape" mc:Ignorable="w14 w15 w16se w16cid w16 w16cex w16sdtdh w16sdtfl w16du wp14">
+  <w:abstractNum w:abstractNumId="0" w15:restartNumberingAfterBreak="0">
+    <w:nsid w:val="0BE44C80"/>
+    <w:multiLevelType w:val="multilevel"/>
+    <w:tmpl w:val="28360D72"/>
+    <w:lvl w:ilvl="0">
+      <w:start w:val="1"/>
+      <w:numFmt w:val="bullet"/>
+      <w:lvlText w:val=""/>
+      <w:lvlJc w:val="left"/>
+      <w:pPr>
+        <w:tabs>
+          <w:tab w:val="num" w:pos="720"/>
+        </w:tabs>
+        <w:ind w:left="720" w:hanging="360"/>
+      </w:pPr>
+      <w:rPr>
+        <w:rFonts w:ascii="Symbol" w:hAnsi="Symbol" w:hint="default"/>
+        <w:sz w:val="20"/>
+      </w:rPr>
+    </w:lvl>
+    <w:lvl w:ilvl="1" w:tentative="1">
+      <w:start w:val="1"/>
+      <w:numFmt w:val="bullet"/>
+      <w:lvlText w:val="o"/>
+      <w:lvlJc w:val="left"/>
+      <w:pPr>
+        <w:tabs>
+          <w:tab w:val="num" w:pos="1440"/>
+        </w:tabs>
+        <w:ind w:left="1440" w:hanging="360"/>
+      </w:pPr>
+      <w:rPr>
+        <w:rFonts w:ascii="Courier New" w:hAnsi="Courier New" w:hint="default"/>
+        <w:sz w:val="20"/>
+      </w:rPr>
+    </w:lvl>
+    <w:lvl w:ilvl="2" w:tentative="1">
+      <w:start w:val="1"/>
+      <w:numFmt w:val="bullet"/>
+      <w:lvlText w:val=""/>
+      <w:lvlJc w:val="left"/>
+      <w:pPr>
+        <w:tabs>
+          <w:tab w:val="num" w:pos="2160"/>
+        </w:tabs>
+        <w:ind w:left="2160" w:hanging="360"/>
+      </w:pPr>
+      <w:rPr>
+        <w:rFonts w:ascii="Wingdings" w:hAnsi="Wingdings" w:hint="default"/>
+        <w:sz w:val="20"/>
+      </w:rPr>
+    </w:lvl>
+    <w:lvl w:ilvl="3" w:tentative="1">
+      <w:start w:val="1"/>
+      <w:numFmt w:val="bullet"/>
+      <w:lvlText w:val=""/>
+      <w:lvlJc w:val="left"/>
+      <w:pPr>
+        <w:tabs>
+          <w:tab w:val="num" w:pos="2880"/>
+        </w:tabs>
+        <w:ind w:left="2880" w:hanging="360"/>
+      </w:pPr>
+      <w:rPr>
+        <w:rFonts w:ascii="Wingdings" w:hAnsi="Wingdings" w:hint="default"/>
+        <w:sz w:val="20"/>
+      </w:rPr>
+    </w:lvl>
+    <w:lvl w:ilvl="4" w:tentative="1">
+      <w:start w:val="1"/>
+      <w:numFmt w:val="bullet"/>
+      <w:lvlText w:val=""/>
+      <w:lvlJc w:val="left"/>
+      <w:pPr>
+        <w:tabs>
+          <w:tab w:val="num" w:pos="3600"/>
+        </w:tabs>
+        <w:ind w:left="3600" w:hanging="360"/>
+      </w:pPr>
+      <w:rPr>
+        <w:rFonts w:ascii="Wingdings" w:hAnsi="Wingdings" w:hint="default"/>
+        <w:sz w:val="20"/>
+      </w:rPr>
+    </w:lvl>
+    <w:lvl w:ilvl="5" w:tentative="1">
+      <w:start w:val="1"/>
+      <w:numFmt w:val="bullet"/>
+      <w:lvlText w:val=""/>
+      <w:lvlJc w:val="left"/>
+      <w:pPr>
+        <w:tabs>
+          <w:tab w:val="num" w:pos="4320"/>
+        </w:tabs>
+        <w:ind w:left="4320" w:hanging="360"/>
+      </w:pPr>
+      <w:rPr>
+        <w:rFonts w:ascii="Wingdings" w:hAnsi="Wingdings" w:hint="default"/>
+        <w:sz w:val="20"/>
+      </w:rPr>
+    </w:lvl>
+    <w:lvl w:ilvl="6" w:tentative="1">
+      <w:start w:val="1"/>
+      <w:numFmt w:val="bullet"/>
+      <w:lvlText w:val=""/>
+      <w:lvlJc w:val="left"/>
+      <w:pPr>
+        <w:tabs>
+          <w:tab w:val="num" w:pos="5040"/>
+        </w:tabs>
+        <w:ind w:left="5040" w:hanging="360"/>
+      </w:pPr>
+      <w:rPr>
+        <w:rFonts w:ascii="Wingdings" w:hAnsi="Wingdings" w:hint="default"/>
+        <w:sz w:val="20"/>
+      </w:rPr>
+    </w:lvl>
+    <w:lvl w:ilvl="7" w:tentative="1">
+      <w:start w:val="1"/>
+      <w:numFmt w:val="bullet"/>
+      <w:lvlText w:val=""/>
+      <w:lvlJc w:val="left"/>
+      <w:pPr>
+        <w:tabs>
+          <w:tab w:val="num" w:pos="5760"/>
+        </w:tabs>
+        <w:ind w:left="5760" w:hanging="360"/>
+      </w:pPr>
+      <w:rPr>
+        <w:rFonts w:ascii="Wingdings" w:hAnsi="Wingdings" w:hint="default"/>
+        <w:sz w:val="20"/>
+      </w:rPr>
+    </w:lvl>
+    <w:lvl w:ilvl="8" w:tentative="1">
+      <w:start w:val="1"/>
+      <w:numFmt w:val="bullet"/>
+      <w:lvlText w:val=""/>
+      <w:lvlJc w:val="left"/>
+      <w:pPr>
+        <w:tabs>
+          <w:tab w:val="num" w:pos="6480"/>
+        </w:tabs>
+        <w:ind w:left="6480" w:hanging="360"/>
+      </w:pPr>
+      <w:rPr>
+        <w:rFonts w:ascii="Wingdings" w:hAnsi="Wingdings" w:hint="default"/>
+        <w:sz w:val="20"/>
+      </w:rPr>
+    </w:lvl>
+  </w:abstractNum>
+  <w:abstractNum w:abstractNumId="1" w15:restartNumberingAfterBreak="0">
+    <w:nsid w:val="3F2702F3"/>
+    <w:multiLevelType w:val="multilevel"/>
+    <w:tmpl w:val="A5EE09B8"/>
+    <w:lvl w:ilvl="0">
+      <w:start w:val="1"/>
+      <w:numFmt w:val="bullet"/>
+      <w:lvlText w:val=""/>
+      <w:lvlJc w:val="left"/>
+      <w:pPr>
+        <w:tabs>
+          <w:tab w:val="num" w:pos="720"/>
+        </w:tabs>
+        <w:ind w:left="720" w:hanging="360"/>
+      </w:pPr>
+      <w:rPr>
+        <w:rFonts w:ascii="Symbol" w:hAnsi="Symbol" w:hint="default"/>
+        <w:sz w:val="20"/>
+      </w:rPr>
+    </w:lvl>
+    <w:lvl w:ilvl="1" w:tentative="1">
+      <w:start w:val="1"/>
+      <w:numFmt w:val="bullet"/>
+      <w:lvlText w:val="o"/>
+      <w:lvlJc w:val="left"/>
+      <w:pPr>
+        <w:tabs>
+          <w:tab w:val="num" w:pos="1440"/>
+        </w:tabs>
+        <w:ind w:left="1440" w:hanging="360"/>
+      </w:pPr>
+      <w:rPr>
+        <w:rFonts w:ascii="Courier New" w:hAnsi="Courier New" w:hint="default"/>
+        <w:sz w:val="20"/>
+      </w:rPr>
+    </w:lvl>
+    <w:lvl w:ilvl="2" w:tentative="1">
+      <w:start w:val="1"/>
+      <w:numFmt w:val="bullet"/>
+      <w:lvlText w:val=""/>
+      <w:lvlJc w:val="left"/>
+      <w:pPr>
+        <w:tabs>
+          <w:tab w:val="num" w:pos="2160"/>
+        </w:tabs>
+        <w:ind w:left="2160" w:hanging="360"/>
+      </w:pPr>
+      <w:rPr>
+        <w:rFonts w:ascii="Wingdings" w:hAnsi="Wingdings" w:hint="default"/>
+        <w:sz w:val="20"/>
+      </w:rPr>
+    </w:lvl>
+    <w:lvl w:ilvl="3" w:tentative="1">
+      <w:start w:val="1"/>
+      <w:numFmt w:val="bullet"/>
+      <w:lvlText w:val=""/>
+      <w:lvlJc w:val="left"/>
+      <w:pPr>
+        <w:tabs>
+          <w:tab w:val="num" w:pos="2880"/>
+        </w:tabs>
+        <w:ind w:left="2880" w:hanging="360"/>
+      </w:pPr>
+      <w:rPr>
+        <w:rFonts w:ascii="Wingdings" w:hAnsi="Wingdings" w:hint="default"/>
+        <w:sz w:val="20"/>
+      </w:rPr>
+    </w:lvl>
+    <w:lvl w:ilvl="4" w:tentative="1">
+      <w:start w:val="1"/>
+      <w:numFmt w:val="bullet"/>
+      <w:lvlText w:val=""/>
+      <w:lvlJc w:val="left"/>
+      <w:pPr>
+        <w:tabs>
+          <w:tab w:val="num" w:pos="3600"/>
+        </w:tabs>
+        <w:ind w:left="3600" w:hanging="360"/>
+      </w:pPr>
+      <w:rPr>
+        <w:rFonts w:ascii="Wingdings" w:hAnsi="Wingdings" w:hint="default"/>
+        <w:sz w:val="20"/>
+      </w:rPr>
+    </w:lvl>
+    <w:lvl w:ilvl="5" w:tentative="1">
+      <w:start w:val="1"/>
+      <w:numFmt w:val="bullet"/>
+      <w:lvlText w:val=""/>
+      <w:lvlJc w:val="left"/>
+      <w:pPr>
+        <w:tabs>
+          <w:tab w:val="num" w:pos="4320"/>
+        </w:tabs>
+        <w:ind w:left="4320" w:hanging="360"/>
+      </w:pPr>
+      <w:rPr>
+        <w:rFonts w:ascii="Wingdings" w:hAnsi="Wingdings" w:hint="default"/>
+        <w:sz w:val="20"/>
+      </w:rPr>
+    </w:lvl>
+    <w:lvl w:ilvl="6" w:tentative="1">
+      <w:start w:val="1"/>
+      <w:numFmt w:val="bullet"/>
+      <w:lvlText w:val=""/>
+      <w:lvlJc w:val="left"/>
+      <w:pPr>
+        <w:tabs>
+          <w:tab w:val="num" w:pos="5040"/>
+        </w:tabs>
+        <w:ind w:left="5040" w:hanging="360"/>
+      </w:pPr>
+      <w:rPr>
+        <w:rFonts w:ascii="Wingdings" w:hAnsi="Wingdings" w:hint="default"/>
+        <w:sz w:val="20"/>
+      </w:rPr>
+    </w:lvl>
+    <w:lvl w:ilvl="7" w:tentative="1">
+      <w:start w:val="1"/>
+      <w:numFmt w:val="bullet"/>
+      <w:lvlText w:val=""/>
+      <w:lvlJc w:val="left"/>
+      <w:pPr>
+        <w:tabs>
+          <w:tab w:val="num" w:pos="5760"/>
+        </w:tabs>
+        <w:ind w:left="5760" w:hanging="360"/>
+      </w:pPr>
+      <w:rPr>
+        <w:rFonts w:ascii="Wingdings" w:hAnsi="Wingdings" w:hint="default"/>
+        <w:sz w:val="20"/>
+      </w:rPr>
+    </w:lvl>
+    <w:lvl w:ilvl="8" w:tentative="1">
+      <w:start w:val="1"/>
+      <w:numFmt w:val="bullet"/>
+      <w:lvlText w:val=""/>
+      <w:lvlJc w:val="left"/>
+      <w:pPr>
+        <w:tabs>
+          <w:tab w:val="num" w:pos="6480"/>
+        </w:tabs>
+        <w:ind w:left="6480" w:hanging="360"/>
+      </w:pPr>
+      <w:rPr>
+        <w:rFonts w:ascii="Wingdings" w:hAnsi="Wingdings" w:hint="default"/>
+        <w:sz w:val="20"/>
+      </w:rPr>
+    </w:lvl>
+  </w:abstractNum>
+  <w:abstractNum w:abstractNumId="2" w15:restartNumberingAfterBreak="0">
+    <w:nsid w:val="3F781F2D"/>
+    <w:multiLevelType w:val="multilevel"/>
+    <w:tmpl w:val="61D49450"/>
+    <w:lvl w:ilvl="0">
+      <w:start w:val="1"/>
+      <w:numFmt w:val="bullet"/>
+      <w:lvlText w:val=""/>
+      <w:lvlJc w:val="left"/>
+      <w:pPr>
+        <w:tabs>
+          <w:tab w:val="num" w:pos="720"/>
+        </w:tabs>
+        <w:ind w:left="720" w:hanging="360"/>
+      </w:pPr>
+      <w:rPr>
+        <w:rFonts w:ascii="Symbol" w:hAnsi="Symbol" w:hint="default"/>
+        <w:sz w:val="20"/>
+      </w:rPr>
+    </w:lvl>
+    <w:lvl w:ilvl="1" w:tentative="1">
+      <w:start w:val="1"/>
+      <w:numFmt w:val="bullet"/>
+      <w:lvlText w:val="o"/>
+      <w:lvlJc w:val="left"/>
+      <w:pPr>
+        <w:tabs>
+          <w:tab w:val="num" w:pos="1440"/>
+        </w:tabs>
+        <w:ind w:left="1440" w:hanging="360"/>
+      </w:pPr>
+      <w:rPr>
+        <w:rFonts w:ascii="Courier New" w:hAnsi="Courier New" w:hint="default"/>
+        <w:sz w:val="20"/>
+      </w:rPr>
+    </w:lvl>
+    <w:lvl w:ilvl="2" w:tentative="1">
+      <w:start w:val="1"/>
+      <w:numFmt w:val="bullet"/>
+      <w:lvlText w:val=""/>
+      <w:lvlJc w:val="left"/>
+      <w:pPr>
+        <w:tabs>
+          <w:tab w:val="num" w:pos="2160"/>
+        </w:tabs>
+        <w:ind w:left="2160" w:hanging="360"/>
+      </w:pPr>
+      <w:rPr>
+        <w:rFonts w:ascii="Wingdings" w:hAnsi="Wingdings" w:hint="default"/>
+        <w:sz w:val="20"/>
+      </w:rPr>
+    </w:lvl>
+    <w:lvl w:ilvl="3" w:tentative="1">
+      <w:start w:val="1"/>
+      <w:numFmt w:val="bullet"/>
+      <w:lvlText w:val=""/>
+      <w:lvlJc w:val="left"/>
+      <w:pPr>
+        <w:tabs>
+          <w:tab w:val="num" w:pos="2880"/>
+        </w:tabs>
+        <w:ind w:left="2880" w:hanging="360"/>
+      </w:pPr>
+      <w:rPr>
+        <w:rFonts w:ascii="Wingdings" w:hAnsi="Wingdings" w:hint="default"/>
+        <w:sz w:val="20"/>
+      </w:rPr>
+    </w:lvl>
+    <w:lvl w:ilvl="4" w:tentative="1">
+      <w:start w:val="1"/>
+      <w:numFmt w:val="bullet"/>
+      <w:lvlText w:val=""/>
+      <w:lvlJc w:val="left"/>
+      <w:pPr>
+        <w:tabs>
+          <w:tab w:val="num" w:pos="3600"/>
+        </w:tabs>
+        <w:ind w:left="3600" w:hanging="360"/>
+      </w:pPr>
+      <w:rPr>
+        <w:rFonts w:ascii="Wingdings" w:hAnsi="Wingdings" w:hint="default"/>
+        <w:sz w:val="20"/>
+      </w:rPr>
+    </w:lvl>
+    <w:lvl w:ilvl="5" w:tentative="1">
+      <w:start w:val="1"/>
+      <w:numFmt w:val="bullet"/>
+      <w:lvlText w:val=""/>
+      <w:lvlJc w:val="left"/>
+      <w:pPr>
+        <w:tabs>
+          <w:tab w:val="num" w:pos="4320"/>
+        </w:tabs>
+        <w:ind w:left="4320" w:hanging="360"/>
+      </w:pPr>
+      <w:rPr>
+        <w:rFonts w:ascii="Wingdings" w:hAnsi="Wingdings" w:hint="default"/>
+        <w:sz w:val="20"/>
+      </w:rPr>
+    </w:lvl>
+    <w:lvl w:ilvl="6" w:tentative="1">
+      <w:start w:val="1"/>
+      <w:numFmt w:val="bullet"/>
+      <w:lvlText w:val=""/>
+      <w:lvlJc w:val="left"/>
+      <w:pPr>
+        <w:tabs>
+          <w:tab w:val="num" w:pos="5040"/>
+        </w:tabs>
+        <w:ind w:left="5040" w:hanging="360"/>
+      </w:pPr>
+      <w:rPr>
+        <w:rFonts w:ascii="Wingdings" w:hAnsi="Wingdings" w:hint="default"/>
+        <w:sz w:val="20"/>
+      </w:rPr>
+    </w:lvl>
+    <w:lvl w:ilvl="7" w:tentative="1">
+      <w:start w:val="1"/>
+      <w:numFmt w:val="bullet"/>
+      <w:lvlText w:val=""/>
+      <w:lvlJc w:val="left"/>
+      <w:pPr>
+        <w:tabs>
+          <w:tab w:val="num" w:pos="5760"/>
+        </w:tabs>
+        <w:ind w:left="5760" w:hanging="360"/>
+      </w:pPr>
+      <w:rPr>
+        <w:rFonts w:ascii="Wingdings" w:hAnsi="Wingdings" w:hint="default"/>
+        <w:sz w:val="20"/>
+      </w:rPr>
+    </w:lvl>
+    <w:lvl w:ilvl="8" w:tentative="1">
+      <w:start w:val="1"/>
+      <w:numFmt w:val="bullet"/>
+      <w:lvlText w:val=""/>
+      <w:lvlJc w:val="left"/>
+      <w:pPr>
+        <w:tabs>
+          <w:tab w:val="num" w:pos="6480"/>
+        </w:tabs>
+        <w:ind w:left="6480" w:hanging="360"/>
+      </w:pPr>
+      <w:rPr>
+        <w:rFonts w:ascii="Wingdings" w:hAnsi="Wingdings" w:hint="default"/>
+        <w:sz w:val="20"/>
+      </w:rPr>
+    </w:lvl>
+  </w:abstractNum>
+  <w:abstractNum w:abstractNumId="3" w15:restartNumberingAfterBreak="0">
+    <w:nsid w:val="723402EE"/>
+    <w:multiLevelType w:val="multilevel"/>
+    <w:tmpl w:val="4B50A09A"/>
+    <w:lvl w:ilvl="0">
+      <w:start w:val="1"/>
+      <w:numFmt w:val="bullet"/>
+      <w:lvlText w:val=""/>
+      <w:lvlJc w:val="left"/>
+      <w:pPr>
+        <w:tabs>
+          <w:tab w:val="num" w:pos="720"/>
+        </w:tabs>
+        <w:ind w:left="720" w:hanging="360"/>
+      </w:pPr>
+      <w:rPr>
+        <w:rFonts w:ascii="Symbol" w:hAnsi="Symbol" w:hint="default"/>
+        <w:sz w:val="20"/>
+      </w:rPr>
+    </w:lvl>
+    <w:lvl w:ilvl="1" w:tentative="1">
+      <w:start w:val="1"/>
+      <w:numFmt w:val="bullet"/>
+      <w:lvlText w:val="o"/>
+      <w:lvlJc w:val="left"/>
+      <w:pPr>
+        <w:tabs>
+          <w:tab w:val="num" w:pos="1440"/>
+        </w:tabs>
+        <w:ind w:left="1440" w:hanging="360"/>
+      </w:pPr>
+      <w:rPr>
+        <w:rFonts w:ascii="Courier New" w:hAnsi="Courier New" w:hint="default"/>
+        <w:sz w:val="20"/>
+      </w:rPr>
+    </w:lvl>
+    <w:lvl w:ilvl="2" w:tentative="1">
+      <w:start w:val="1"/>
+      <w:numFmt w:val="bullet"/>
+      <w:lvlText w:val=""/>
+      <w:lvlJc w:val="left"/>
+      <w:pPr>
+        <w:tabs>
+          <w:tab w:val="num" w:pos="2160"/>
+        </w:tabs>
+        <w:ind w:left="2160" w:hanging="360"/>
+      </w:pPr>
+      <w:rPr>
+        <w:rFonts w:ascii="Wingdings" w:hAnsi="Wingdings" w:hint="default"/>
+        <w:sz w:val="20"/>
+      </w:rPr>
+    </w:lvl>
+    <w:lvl w:ilvl="3" w:tentative="1">
+      <w:start w:val="1"/>
+      <w:numFmt w:val="bullet"/>
+      <w:lvlText w:val=""/>
+      <w:lvlJc w:val="left"/>
+      <w:pPr>
+        <w:tabs>
+          <w:tab w:val="num" w:pos="2880"/>
+        </w:tabs>
+        <w:ind w:left="2880" w:hanging="360"/>
+      </w:pPr>
+      <w:rPr>
+        <w:rFonts w:ascii="Wingdings" w:hAnsi="Wingdings" w:hint="default"/>
+        <w:sz w:val="20"/>
+      </w:rPr>
+    </w:lvl>
+    <w:lvl w:ilvl="4" w:tentative="1">
+      <w:start w:val="1"/>
+      <w:numFmt w:val="bullet"/>
+      <w:lvlText w:val=""/>
+      <w:lvlJc w:val="left"/>
+      <w:pPr>
+        <w:tabs>
+          <w:tab w:val="num" w:pos="3600"/>
+        </w:tabs>
+        <w:ind w:left="3600" w:hanging="360"/>
+      </w:pPr>
+      <w:rPr>
+        <w:rFonts w:ascii="Wingdings" w:hAnsi="Wingdings" w:hint="default"/>
+        <w:sz w:val="20"/>
+      </w:rPr>
+    </w:lvl>
+    <w:lvl w:ilvl="5" w:tentative="1">
+      <w:start w:val="1"/>
+      <w:numFmt w:val="bullet"/>
+      <w:lvlText w:val=""/>
+      <w:lvlJc w:val="left"/>
+      <w:pPr>
+        <w:tabs>
+          <w:tab w:val="num" w:pos="4320"/>
+        </w:tabs>
+        <w:ind w:left="4320" w:hanging="360"/>
+      </w:pPr>
+      <w:rPr>
+        <w:rFonts w:ascii="Wingdings" w:hAnsi="Wingdings" w:hint="default"/>
+        <w:sz w:val="20"/>
+      </w:rPr>
+    </w:lvl>
+    <w:lvl w:ilvl="6" w:tentative="1">
+      <w:start w:val="1"/>
+      <w:numFmt w:val="bullet"/>
+      <w:lvlText w:val=""/>
+      <w:lvlJc w:val="left"/>
+      <w:pPr>
+        <w:tabs>
+          <w:tab w:val="num" w:pos="5040"/>
+        </w:tabs>
+        <w:ind w:left="5040" w:hanging="360"/>
+      </w:pPr>
+      <w:rPr>
+        <w:rFonts w:ascii="Wingdings" w:hAnsi="Wingdings" w:hint="default"/>
+        <w:sz w:val="20"/>
+      </w:rPr>
+    </w:lvl>
+    <w:lvl w:ilvl="7" w:tentative="1">
+      <w:start w:val="1"/>
+      <w:numFmt w:val="bullet"/>
+      <w:lvlText w:val=""/>
+      <w:lvlJc w:val="left"/>
+      <w:pPr>
+        <w:tabs>
+          <w:tab w:val="num" w:pos="5760"/>
+        </w:tabs>
+        <w:ind w:left="5760" w:hanging="360"/>
+      </w:pPr>
+      <w:rPr>
+        <w:rFonts w:ascii="Wingdings" w:hAnsi="Wingdings" w:hint="default"/>
+        <w:sz w:val="20"/>
+      </w:rPr>
+    </w:lvl>
+    <w:lvl w:ilvl="8" w:tentative="1">
+      <w:start w:val="1"/>
+      <w:numFmt w:val="bullet"/>
+      <w:lvlText w:val=""/>
+      <w:lvlJc w:val="left"/>
+      <w:pPr>
+        <w:tabs>
+          <w:tab w:val="num" w:pos="6480"/>
+        </w:tabs>
+        <w:ind w:left="6480" w:hanging="360"/>
+      </w:pPr>
+      <w:rPr>
+        <w:rFonts w:ascii="Wingdings" w:hAnsi="Wingdings" w:hint="default"/>
+        <w:sz w:val="20"/>
+      </w:rPr>
+    </w:lvl>
+  </w:abstractNum>
+  <w:num w:numId="1" w16cid:durableId="319387296">
+    <w:abstractNumId w:val="2"/>
+  </w:num>
+  <w:num w:numId="2" w16cid:durableId="1677221540">
+    <w:abstractNumId w:val="3"/>
+  </w:num>
+  <w:num w:numId="3" w16cid:durableId="291448652">
+    <w:abstractNumId w:val="1"/>
+  </w:num>
+  <w:num w:numId="4" w16cid:durableId="486475692">
+    <w:abstractNumId w:val="0"/>
+  </w:num>
+</w:numbering>
 </file>
 
 <file path=word/styles.xml><?xml version="1.0" encoding="utf-8"?>
@@ -654,7 +4884,6 @@
   <w:style w:type="character" w:default="1" w:styleId="DefaultParagraphFont">
     <w:name w:val="Default Paragraph Font"/>
     <w:uiPriority w:val="1"/>
-    <w:semiHidden/>
     <w:unhideWhenUsed/>
   </w:style>
   <w:style w:type="table" w:default="1" w:styleId="TableNormal">

</xml_diff>